<commit_message>
Update methodology Word file: hosted-parameter annex, verified livestock and irrigation sources
Co-Authored-By: Claude Opus 5.5 <noreply@anthropic.com>
Claude-Session: https://claude.ai/code/session_01GDeG8uxAFfNYAs7y3YT8qE
</commit_message>
<xml_diff>
--- a/Green_water_footprint_i-CLEANED_revised_methodology.docx
+++ b/Green_water_footprint_i-CLEANED_revised_methodology.docx
@@ -897,7 +897,7 @@
           <w:p>
             <w:pPr/>
             <w:r>
-              <w:t xml:space="preserve">Mialyk et al. (2024) green and blue crop water use (mm) by region × crop × rainfed/irrigated, with crop proxies as in Damerau (2024), Table 1</w:t>
+              <w:t xml:space="preserve">Mialyk et al. (2024) crop water use (mm per season) by region × crop × rainfed/irrigated, split into green and blue; i-CLEANED crop mapping</w:t>
             </w:r>
           </w:p>
         </w:tc>
@@ -919,20 +919,20 @@
           <w:p>
             <w:pPr/>
             <w:r>
-              <w:t xml:space="preserve">New lookup</w:t>
-            </w:r>
-          </w:p>
-        </w:tc>
-      </w:tr>
-      <w:tr>
-        <w:tc>
-          <w:tcPr>
-            <w:tcW w:w="3120" w:type="dxa"/>
-          </w:tcPr>
-          <w:p>
-            <w:pPr/>
-            <w:r>
-              <w:t xml:space="preserve">Monthly climate normals (ET0, precipitation, temperature) by region, e.g. CHIRPS rainfall, TerraClimate or FAO WaPOR ET0</w:t>
+              <w:t xml:space="preserve">Built: 43 crops × 2,620 regions (Annex A)</w:t>
+            </w:r>
+          </w:p>
+        </w:tc>
+      </w:tr>
+      <w:tr>
+        <w:tc>
+          <w:tcPr>
+            <w:tcW w:w="3120" w:type="dxa"/>
+          </w:tcPr>
+          <w:p>
+            <w:pPr/>
+            <w:r>
+              <w:t xml:space="preserve">Monthly climate normals: precipitation, effective rainfall, ET0 (FAO-56 Penman-Monteith), temperature</w:t>
             </w:r>
           </w:p>
         </w:tc>
@@ -954,20 +954,20 @@
           <w:p>
             <w:pPr/>
             <w:r>
-              <w:t xml:space="preserve">New lookup or climate API</w:t>
-            </w:r>
-          </w:p>
-        </w:tc>
-      </w:tr>
-      <w:tr>
-        <w:tc>
-          <w:tcPr>
-            <w:tcW w:w="3120" w:type="dxa"/>
-          </w:tcPr>
-          <w:p>
-            <w:pPr/>
-            <w:r>
-              <w:t xml:space="preserve">FAO-56 growth-stage lengths (Table 11) and pasture Kc (Table 12)</w:t>
+              <w:t xml:space="preserve">Built from WorldClim 2.1 (Annex A)</w:t>
+            </w:r>
+          </w:p>
+        </w:tc>
+      </w:tr>
+      <w:tr>
+        <w:tc>
+          <w:tcPr>
+            <w:tcW w:w="3120" w:type="dxa"/>
+          </w:tcPr>
+          <w:p>
+            <w:pPr/>
+            <w:r>
+              <w:t xml:space="preserve">FAO-56 growth-stage lengths (Table 11) and crop coefficients (Table 12)</w:t>
             </w:r>
           </w:p>
         </w:tc>
@@ -989,7 +989,7 @@
           <w:p>
             <w:pPr/>
             <w:r>
-              <w:t xml:space="preserve">New lookup</w:t>
+              <w:t xml:space="preserve">Built (Annex A)</w:t>
             </w:r>
           </w:p>
         </w:tc>
@@ -1024,7 +1024,7 @@
           <w:p>
             <w:pPr/>
             <w:r>
-              <w:t xml:space="preserve">New lookup</w:t>
+              <w:t xml:space="preserve">Pending: team input</w:t>
             </w:r>
           </w:p>
         </w:tc>
@@ -1059,7 +1059,7 @@
           <w:p>
             <w:pPr/>
             <w:r>
-              <w:t xml:space="preserve">Revised defaults</w:t>
+              <w:t xml:space="preserve">Pending: expert confirmation</w:t>
             </w:r>
           </w:p>
         </w:tc>
@@ -1107,7 +1107,29 @@
           <w:p>
             <w:pPr/>
             <w:r>
-              <w:t xml:space="preserve">Drinking water per livestock type (</w:t>
+              <w:t xml:space="preserve">Drinking and service water per livestock type</w:t>
+            </w:r>
+          </w:p>
+        </w:tc>
+        <w:tc>
+          <w:tcPr>
+            <w:tcW w:w="3120" w:type="dxa"/>
+          </w:tcPr>
+          <w:p>
+            <w:pPr/>
+            <w:r>
+              <w:t xml:space="preserve">Eqs. 16–17</w:t>
+            </w:r>
+          </w:p>
+        </w:tc>
+        <w:tc>
+          <w:tcPr>
+            <w:tcW w:w="3120" w:type="dxa"/>
+          </w:tcPr>
+          <w:p>
+            <w:pPr/>
+            <w:r>
+              <w:t xml:space="preserve">Built from Chapagain and Hoekstra (2003); replaces the undocumented legacy </w:t>
             </w:r>
             <w:r>
               <w:rPr>
@@ -1116,77 +1138,55 @@
               <w:t xml:space="preserve">water_requirement</w:t>
             </w:r>
             <w:r>
-              <w:t xml:space="preserve">)</w:t>
-            </w:r>
-          </w:p>
-        </w:tc>
-        <w:tc>
-          <w:tcPr>
-            <w:tcW w:w="3120" w:type="dxa"/>
-          </w:tcPr>
-          <w:p>
-            <w:pPr/>
-            <w:r>
-              <w:t xml:space="preserve">Eq. 16</w:t>
-            </w:r>
-          </w:p>
-        </w:tc>
-        <w:tc>
-          <w:tcPr>
-            <w:tcW w:w="3120" w:type="dxa"/>
-          </w:tcPr>
-          <w:p>
-            <w:pPr/>
-            <w:r>
-              <w:t xml:space="preserve">Existing; unit and source to be documented</w:t>
-            </w:r>
-          </w:p>
-        </w:tc>
-      </w:tr>
-      <w:tr>
-        <w:tc>
-          <w:tcPr>
-            <w:tcW w:w="3120" w:type="dxa"/>
-          </w:tcPr>
-          <w:p>
-            <w:pPr/>
-            <w:r>
-              <w:t xml:space="preserve">Service water defaults; irrigation application efficiencies</w:t>
-            </w:r>
-          </w:p>
-        </w:tc>
-        <w:tc>
-          <w:tcPr>
-            <w:tcW w:w="3120" w:type="dxa"/>
-          </w:tcPr>
-          <w:p>
-            <w:pPr/>
-            <w:r>
-              <w:t xml:space="preserve">Sections 10.2, 10.4</w:t>
-            </w:r>
-          </w:p>
-        </w:tc>
-        <w:tc>
-          <w:tcPr>
-            <w:tcW w:w="3120" w:type="dxa"/>
-          </w:tcPr>
-          <w:p>
-            <w:pPr/>
-            <w:r>
-              <w:t xml:space="preserve">New lookup</w:t>
-            </w:r>
-          </w:p>
-        </w:tc>
-      </w:tr>
-      <w:tr>
-        <w:tc>
-          <w:tcPr>
-            <w:tcW w:w="3120" w:type="dxa"/>
-          </w:tcPr>
-          <w:p>
-            <w:pPr/>
-            <w:r>
-              <w:t xml:space="preserve">Aqueduct 4.0 stress class; WaterGAP 2.2e renewable water per ha, by region</w:t>
+              <w:t xml:space="preserve"> (Annex A)</w:t>
+            </w:r>
+          </w:p>
+        </w:tc>
+      </w:tr>
+      <w:tr>
+        <w:tc>
+          <w:tcPr>
+            <w:tcW w:w="3120" w:type="dxa"/>
+          </w:tcPr>
+          <w:p>
+            <w:pPr/>
+            <w:r>
+              <w:t xml:space="preserve">Irrigation application and conveyance efficiencies</w:t>
+            </w:r>
+          </w:p>
+        </w:tc>
+        <w:tc>
+          <w:tcPr>
+            <w:tcW w:w="3120" w:type="dxa"/>
+          </w:tcPr>
+          <w:p>
+            <w:pPr/>
+            <w:r>
+              <w:t xml:space="preserve">Section 10.2</w:t>
+            </w:r>
+          </w:p>
+        </w:tc>
+        <w:tc>
+          <w:tcPr>
+            <w:tcW w:w="3120" w:type="dxa"/>
+          </w:tcPr>
+          <w:p>
+            <w:pPr/>
+            <w:r>
+              <w:t xml:space="preserve">Built (Annex A)</w:t>
+            </w:r>
+          </w:p>
+        </w:tc>
+      </w:tr>
+      <w:tr>
+        <w:tc>
+          <w:tcPr>
+            <w:tcW w:w="3120" w:type="dxa"/>
+          </w:tcPr>
+          <w:p>
+            <w:pPr/>
+            <w:r>
+              <w:t xml:space="preserve">Aqueduct 4.0 stress class; WaterGAP 2.2e water availability per ha, by region</w:t>
             </w:r>
           </w:p>
         </w:tc>
@@ -1208,7 +1208,7 @@
           <w:p>
             <w:pPr/>
             <w:r>
-              <w:t xml:space="preserve">New lookup (pre-processed rasters)</w:t>
+              <w:t xml:space="preserve">Built (Annex A)</w:t>
             </w:r>
           </w:p>
         </w:tc>
@@ -6687,7 +6687,7 @@
         <w:t xml:space="preserve">e_a</w:t>
       </w:r>
       <w:r>
-        <w:t xml:space="preserve"> is the field application efficiency. Typical defaults are surface 0.60, sprinkler 0.75 and drip 0.90 (Brouwer et al. 1989 †). Blue water per feed item then follows Eq. 6, with BWU in place of GWU and the </w:t>
+        <w:t xml:space="preserve"> is the field application efficiency. Typical defaults are surface 0.60, sprinkler 0.75 and drip 0.90 (Brouwer et al. 1989, Annex 1, Table 8). Blue water per feed item then follows Eq. 6, with BWU in place of GWU and the </w:t>
       </w:r>
       <w:r>
         <w:rPr>
@@ -6803,16 +6803,7 @@
         <w:t xml:space="preserve">Tier 1 (default):</w:t>
       </w:r>
       <w:r>
-        <w:t xml:space="preserve"> the drinking water table already in the i-CLEANED database (</w:t>
-      </w:r>
-      <w:r>
-        <w:rPr>
-          <w:rStyle w:val="CodeChar"/>
-        </w:rPr>
-        <w:t xml:space="preserve">lkp_livetype.water_requirement</w:t>
-      </w:r>
-      <w:r>
-        <w:t xml:space="preserve">, one value per livestock type, e.g. improved cow 140, ewe 14, sow 40):</w:t>
+        <w:t xml:space="preserve"> drinking water per livestock type and production system (grazing, mixed or industrial) from Chapagain and Hoekstra (2003, Table 3.8), the values used by Mekonnen and Hoekstra (2010). For example, a milking cow drinks 40 L/day in grazing systems and 70 L/day in industrial ones; an adult sheep 6.0–7.6 L/day (Annex A, livestock_water_icleaned.csv):</w:t>
       </w:r>
     </w:p>
     <w:p>
@@ -6828,16 +6819,34 @@
     <w:p>
       <w:pPr/>
       <w:r>
-        <w:t xml:space="preserve">Before use, the unit (assumed L/head/day), the source and the coverage of WR_k must be documented. The questions are whether it covers drinking only or also service water, and whether it is free drinking water or total water intake. If it is total intake, subtract the water in the feed: W_feed = Σ_i DM_i · (100 − dm_i)/dm_i, using </w:t>
+        <w:t xml:space="preserve">The legacy i-CLEANED value (</w:t>
       </w:r>
       <w:r>
         <w:rPr>
           <w:rStyle w:val="CodeChar"/>
         </w:rPr>
+        <w:t xml:space="preserve">lkp_livetype.water_requirement</w:t>
+      </w:r>
+      <w:r>
+        <w:t xml:space="preserve"> in </w:t>
+      </w:r>
+      <w:r>
+        <w:rPr>
+          <w:rStyle w:val="CodeChar"/>
+        </w:rPr>
+        <w:t xml:space="preserve">cleaned.sqlite</w:t>
+      </w:r>
+      <w:r>
+        <w:t xml:space="preserve">, e.g. 140 L/day for an improved cow) is undocumented and two to three times the published drinking water, so it probably represents total water intake. It is not used. The published values are free drinking water, so feed moisture is not subtracted. For reference, fresh forage at 20% DM supplies about 4 L of water per kg DM eaten (from </w:t>
+      </w:r>
+      <w:r>
+        <w:rPr>
+          <w:rStyle w:val="CodeChar"/>
+        </w:rPr>
         <w:t xml:space="preserve">dm_content</w:t>
       </w:r>
       <w:r>
-        <w:t xml:space="preserve"> (%). Fresh forage at 20% DM supplies about 4 L per kg DM eaten.</w:t>
+        <w:t xml:space="preserve">).</w:t>
       </w:r>
     </w:p>
     <w:p>
@@ -6875,7 +6884,7 @@
     <w:p>
       <w:pPr/>
       <w:r>
-        <w:t xml:space="preserve">Service water (cleaning, cooling) uses default litres per head per day by species and production system from Mekonnen and Hoekstra (2010) †, editable by the user. It is added only if WR_k (Section 10.3) turns out to exclude it, so it is not counted twice. Feed mixing water (about 0.03% of the total; Mekonnen and Hoekstra 2010) is excluded and declared.</w:t>
+        <w:t xml:space="preserve">Service water (cleaning, cooling) uses Chapagain and Hoekstra (2003, Table 3.9) per livestock type and production system, editable by the user; for example 5 L/day for a milking cow in grazing systems and 22 L/day in industrial ones. Feed mixing water is 0.5 L per kg of concentrate (Chapagain and Hoekstra 2003). It is about 0.03% of the total water footprint (Mekonnen and Hoekstra 2010) and may be omitted, but this must be declared.</w:t>
       </w:r>
     </w:p>
     <w:p>
@@ -7231,7 +7240,7 @@
         </w:numPr>
       </w:pPr>
       <w:r>
-        <w:t xml:space="preserve">Brouwer C, Prins K, Heibloem M (1989) Irrigation water management: irrigation scheduling. Training Manual No. 4. FAO, Rome. † (application efficiencies)</w:t>
+        <w:t xml:space="preserve">Brouwer C, Prins K, Heibloem M (1989) Irrigation water management: irrigation scheduling. Training Manual No. 4. FAO, Rome. Annex 1, Tables 7–8 (efficiencies verified).</w:t>
       </w:r>
     </w:p>
     <w:p>
@@ -7243,6 +7252,18 @@
         </w:numPr>
       </w:pPr>
       <w:r>
+        <w:t xml:space="preserve">Chapagain AK, Hoekstra AY (2003) Virtual water flows between nations in relation to trade in livestock and livestock products. Value of Water Research Report Series No. 13. UNESCO-IHE, Delft. Tables 3.8–3.9.</w:t>
+      </w:r>
+    </w:p>
+    <w:p>
+      <w:pPr>
+        <w:pStyle w:val="ListParagraph"/>
+        <w:numPr>
+          <w:ilvl w:val="0"/>
+          <w:numId w:val="18"/>
+        </w:numPr>
+      </w:pPr>
+      <w:r>
         <w:t xml:space="preserve">Damerau K (2024) Adapting i-CLEANED for evaluating freshwater depletion and water quality impacts of livestock systems. Final report for the Tropical Forages Program, Alliance of Bioversity International and CIAT, 27 December 2024.</w:t>
       </w:r>
     </w:p>
@@ -7291,6 +7312,30 @@
         </w:numPr>
       </w:pPr>
       <w:r>
+        <w:t xml:space="preserve">Fick SE, Hijmans RJ (2017) WorldClim 2: new 1-km spatial resolution climate surfaces for global land areas. International Journal of Climatology 37:4302–4315.</w:t>
+      </w:r>
+    </w:p>
+    <w:p>
+      <w:pPr>
+        <w:pStyle w:val="ListParagraph"/>
+        <w:numPr>
+          <w:ilvl w:val="0"/>
+          <w:numId w:val="18"/>
+        </w:numPr>
+      </w:pPr>
+      <w:r>
+        <w:t xml:space="preserve">GADM (2022) Database of Global Administrative Areas, version 4.1. University of California, Berkeley.</w:t>
+      </w:r>
+    </w:p>
+    <w:p>
+      <w:pPr>
+        <w:pStyle w:val="ListParagraph"/>
+        <w:numPr>
+          <w:ilvl w:val="0"/>
+          <w:numId w:val="18"/>
+        </w:numPr>
+      </w:pPr>
+      <w:r>
         <w:t xml:space="preserve">Hoekstra AY, Chapagain AK, Aldaya MM, Mekonnen MM (2011) The water footprint assessment manual: setting the global standard. Earthscan, London.</w:t>
       </w:r>
     </w:p>
@@ -7363,7 +7408,7 @@
         </w:numPr>
       </w:pPr>
       <w:r>
-        <w:t xml:space="preserve">Mekonnen MM, Hoekstra AY (2010) The green, blue and grey water footprint of farm animals and animal products. Value of Water Research Report Series No. 48. UNESCO-IHE, Delft. † (service water defaults)</w:t>
+        <w:t xml:space="preserve">Mekonnen MM, Hoekstra AY (2010) The green, blue and grey water footprint of farm animals and animal products. Value of Water Research Report Series No. 48. UNESCO-IHE, Delft.</w:t>
       </w:r>
     </w:p>
     <w:p>
@@ -7411,7 +7456,7 @@
         </w:numPr>
       </w:pPr>
       <w:r>
-        <w:t xml:space="preserve">Mialyk O, Schyns JF, Booij MJ, Su H, Hogeboom RJ, Berger M (2024) Water footprints and crop water use of 175 individual crops for 1990–2019 simulated with a global crop model. Scientific Data 11:206.</w:t>
+        <w:t xml:space="preserve">Mialyk O, Schyns JF, Booij MJ, Su H, Hogeboom RJ, Berger M (2024) Water footprints and crop water use of 175 individual crops for 1990–2019 simulated with a global crop model. Scientific Data 11:206. Data: doi:10.4121/7b45bcc6-686b-404d-a910-13c87156716a.</w:t>
       </w:r>
     </w:p>
     <w:p>
@@ -7486,6 +7531,1183 @@
         <w:t xml:space="preserve">Winchester CF, Morris MJ (1956) Water intake rates of cattle. Journal of Animal Science 15:722–740. † (coefficients)</w:t>
       </w:r>
     </w:p>
+    <w:p>
+      <w:pPr>
+        <w:pStyle w:val="Heading2"/>
+      </w:pPr>
+      <w:r>
+        <w:t xml:space="preserve">Annex A. Hosted parameters</w:t>
+      </w:r>
+    </w:p>
+    <w:p>
+      <w:pPr/>
+      <w:r>
+        <w:t xml:space="preserve">i-CLEANED hosts ten parameter tables, so users do not enter them. All are built, for 2,620 GADM 4.1 level-1 regions in 166 countries of the Global South where the data are spatial. They are stored with their build scripts in the repository folder </w:t>
+      </w:r>
+      <w:hyperlink r:id="rId3" w:history="1">
+        <w:r>
+          <w:rPr>
+            <w:rStyle w:val="Hyperlink"/>
+          </w:rPr>
+          <w:t xml:space="preserve">water_parameters</w:t>
+        </w:r>
+      </w:hyperlink>
+      <w:r>
+        <w:t xml:space="preserve">; every value can be regenerated from the public sources listed.</w:t>
+      </w:r>
+    </w:p>
+    <w:p>
+      <w:pPr>
+        <w:pStyle w:val="Heading3"/>
+      </w:pPr>
+      <w:r>
+        <w:t xml:space="preserve">A.1 Tables</w:t>
+      </w:r>
+    </w:p>
+    <w:tbl>
+      <w:tblPr>
+        <w:tblStyle w:val="TableGrid"/>
+        <w:tblW w:w="0" w:type="auto"/>
+        <w:tblLayout w:type="fixed"/>
+        <w:tblLook w:val="04A0" w:firstRow="1" w:lastRow="0" w:firstColumn="0" w:lastColumn="0" w:noHBand="0" w:noVBand="1"/>
+      </w:tblPr>
+      <w:tblGrid>
+        <w:gridCol w:w="1560"/>
+        <w:gridCol w:w="1560"/>
+        <w:gridCol w:w="1560"/>
+        <w:gridCol w:w="1560"/>
+        <w:gridCol w:w="1560"/>
+        <w:gridCol w:w="1560"/>
+      </w:tblGrid>
+      <w:tr>
+        <w:trPr>
+          <w:tblHeader/>
+        </w:trPr>
+        <w:tc>
+          <w:tcPr>
+            <w:tcW w:w="1560" w:type="dxa"/>
+            <w:shd w:val="clear" w:color="auto" w:fill="F2F2F2"/>
+          </w:tcPr>
+          <w:p>
+            <w:pPr/>
+            <w:r>
+              <w:t xml:space="preserve">Table (file)</w:t>
+            </w:r>
+          </w:p>
+        </w:tc>
+        <w:tc>
+          <w:tcPr>
+            <w:tcW w:w="1560" w:type="dxa"/>
+            <w:shd w:val="clear" w:color="auto" w:fill="F2F2F2"/>
+          </w:tcPr>
+          <w:p>
+            <w:pPr/>
+            <w:r>
+              <w:t xml:space="preserve">Parameters</w:t>
+            </w:r>
+          </w:p>
+        </w:tc>
+        <w:tc>
+          <w:tcPr>
+            <w:tcW w:w="1560" w:type="dxa"/>
+            <w:shd w:val="clear" w:color="auto" w:fill="F2F2F2"/>
+          </w:tcPr>
+          <w:p>
+            <w:pPr/>
+            <w:r>
+              <w:t xml:space="preserve">Unit</w:t>
+            </w:r>
+          </w:p>
+        </w:tc>
+        <w:tc>
+          <w:tcPr>
+            <w:tcW w:w="1560" w:type="dxa"/>
+            <w:shd w:val="clear" w:color="auto" w:fill="F2F2F2"/>
+          </w:tcPr>
+          <w:p>
+            <w:pPr/>
+            <w:r>
+              <w:t xml:space="preserve">Equations</w:t>
+            </w:r>
+          </w:p>
+        </w:tc>
+        <w:tc>
+          <w:tcPr>
+            <w:tcW w:w="1560" w:type="dxa"/>
+            <w:shd w:val="clear" w:color="auto" w:fill="F2F2F2"/>
+          </w:tcPr>
+          <w:p>
+            <w:pPr/>
+            <w:r>
+              <w:t xml:space="preserve">Source</w:t>
+            </w:r>
+          </w:p>
+        </w:tc>
+        <w:tc>
+          <w:tcPr>
+            <w:tcW w:w="1560" w:type="dxa"/>
+            <w:shd w:val="clear" w:color="auto" w:fill="F2F2F2"/>
+          </w:tcPr>
+          <w:p>
+            <w:pPr/>
+            <w:r>
+              <w:t xml:space="preserve">Coverage and gaps</w:t>
+            </w:r>
+          </w:p>
+        </w:tc>
+      </w:tr>
+      <w:tr>
+        <w:tc>
+          <w:tcPr>
+            <w:tcW w:w="1560" w:type="dxa"/>
+          </w:tcPr>
+          <w:p>
+            <w:pPr/>
+            <w:r>
+              <w:t xml:space="preserve">admin1_regions.csv</w:t>
+            </w:r>
+          </w:p>
+        </w:tc>
+        <w:tc>
+          <w:tcPr>
+            <w:tcW w:w="1560" w:type="dxa"/>
+          </w:tcPr>
+          <w:p>
+            <w:pPr/>
+            <w:r>
+              <w:t xml:space="preserve">Region list (GID_1, country, name, area)</w:t>
+            </w:r>
+          </w:p>
+        </w:tc>
+        <w:tc>
+          <w:tcPr>
+            <w:tcW w:w="1560" w:type="dxa"/>
+          </w:tcPr>
+          <w:p>
+            <w:pPr/>
+            <w:r>
+              <w:t xml:space="preserve">km²</w:t>
+            </w:r>
+          </w:p>
+        </w:tc>
+        <w:tc>
+          <w:tcPr>
+            <w:tcW w:w="1560" w:type="dxa"/>
+          </w:tcPr>
+          <w:p>
+            <w:pPr/>
+            <w:r>
+              <w:t xml:space="preserve">Region input</w:t>
+            </w:r>
+          </w:p>
+        </w:tc>
+        <w:tc>
+          <w:tcPr>
+            <w:tcW w:w="1560" w:type="dxa"/>
+          </w:tcPr>
+          <w:p>
+            <w:pPr/>
+            <w:r>
+              <w:t xml:space="preserve">GADM 4.1</w:t>
+            </w:r>
+          </w:p>
+        </w:tc>
+        <w:tc>
+          <w:tcPr>
+            <w:tcW w:w="1560" w:type="dxa"/>
+          </w:tcPr>
+          <w:p>
+            <w:pPr/>
+            <w:r>
+              <w:t xml:space="preserve">2,620 regions; 12 small territories have no level-1 units</w:t>
+            </w:r>
+          </w:p>
+        </w:tc>
+      </w:tr>
+      <w:tr>
+        <w:tc>
+          <w:tcPr>
+            <w:tcW w:w="1560" w:type="dxa"/>
+          </w:tcPr>
+          <w:p>
+            <w:pPr/>
+            <w:r>
+              <w:t xml:space="preserve">climate_admin1_monthly.csv</w:t>
+            </w:r>
+          </w:p>
+        </w:tc>
+        <w:tc>
+          <w:tcPr>
+            <w:tcW w:w="1560" w:type="dxa"/>
+          </w:tcPr>
+          <w:p>
+            <w:pPr/>
+            <w:r>
+              <w:t xml:space="preserve">P, Peff (USDA-SCS), ET0 (FAO-56 Penman-Monteith), Tmean, Tmax, per month</w:t>
+            </w:r>
+          </w:p>
+        </w:tc>
+        <w:tc>
+          <w:tcPr>
+            <w:tcW w:w="1560" w:type="dxa"/>
+          </w:tcPr>
+          <w:p>
+            <w:pPr/>
+            <w:r>
+              <w:t xml:space="preserve">mm/month, °C</w:t>
+            </w:r>
+          </w:p>
+        </w:tc>
+        <w:tc>
+          <w:tcPr>
+            <w:tcW w:w="1560" w:type="dxa"/>
+          </w:tcPr>
+          <w:p>
+            <w:pPr/>
+            <w:r>
+              <w:t xml:space="preserve">2–4, 14</w:t>
+            </w:r>
+          </w:p>
+        </w:tc>
+        <w:tc>
+          <w:tcPr>
+            <w:tcW w:w="1560" w:type="dxa"/>
+          </w:tcPr>
+          <w:p>
+            <w:pPr/>
+            <w:r>
+              <w:t xml:space="preserve">WorldClim 2.1, 10′, 1970–2000 normals (Fick and Hijmans 2017); ET0 computed with FAO-56 Eq. 6</w:t>
+            </w:r>
+          </w:p>
+        </w:tc>
+        <w:tc>
+          <w:tcPr>
+            <w:tcW w:w="1560" w:type="dxa"/>
+          </w:tcPr>
+          <w:p>
+            <w:pPr/>
+            <w:r>
+              <w:t xml:space="preserve">All regions; 4 islands use the country mean</w:t>
+            </w:r>
+          </w:p>
+        </w:tc>
+      </w:tr>
+      <w:tr>
+        <w:tc>
+          <w:tcPr>
+            <w:tcW w:w="1560" w:type="dxa"/>
+          </w:tcPr>
+          <w:p>
+            <w:pPr/>
+            <w:r>
+              <w:t xml:space="preserve">crop_water_use_admin1.csv</w:t>
+            </w:r>
+          </w:p>
+        </w:tc>
+        <w:tc>
+          <w:tcPr>
+            <w:tcW w:w="1560" w:type="dxa"/>
+          </w:tcPr>
+          <w:p>
+            <w:pPr/>
+            <w:r>
+              <w:t xml:space="preserve">Crop water use, rainfed and irrigated; green rainfed, green irrigated, blue irrigated; national capillary-rise share</w:t>
+            </w:r>
+          </w:p>
+        </w:tc>
+        <w:tc>
+          <w:tcPr>
+            <w:tcW w:w="1560" w:type="dxa"/>
+          </w:tcPr>
+          <w:p>
+            <w:pPr/>
+            <w:r>
+              <w:t xml:space="preserve">mm/season</w:t>
+            </w:r>
+          </w:p>
+        </w:tc>
+        <w:tc>
+          <w:tcPr>
+            <w:tcW w:w="1560" w:type="dxa"/>
+          </w:tcPr>
+          <w:p>
+            <w:pPr/>
+            <w:r>
+              <w:t xml:space="preserve">5, 13 (Tier 1)</w:t>
+            </w:r>
+          </w:p>
+        </w:tc>
+        <w:tc>
+          <w:tcPr>
+            <w:tcW w:w="1560" w:type="dxa"/>
+          </w:tcPr>
+          <w:p>
+            <w:pPr/>
+            <w:r>
+              <w:t xml:space="preserve">Mialyk et al. (2024), dataset 2.9, 2010–2019; split as in Mekonnen and Hoekstra (2011): blue = irrigated − rainfed</w:t>
+            </w:r>
+          </w:p>
+        </w:tc>
+        <w:tc>
+          <w:tcPr>
+            <w:tcW w:w="1560" w:type="dxa"/>
+          </w:tcPr>
+          <w:p>
+            <w:pPr/>
+            <w:r>
+              <w:t xml:space="preserve">43 crops; regions without the crop use the country or sub-region mean (flagged)</w:t>
+            </w:r>
+          </w:p>
+        </w:tc>
+      </w:tr>
+      <w:tr>
+        <w:tc>
+          <w:tcPr>
+            <w:tcW w:w="1560" w:type="dxa"/>
+          </w:tcPr>
+          <w:p>
+            <w:pPr/>
+            <w:r>
+              <w:t xml:space="preserve">icleaned_crop_mapping.csv</w:t>
+            </w:r>
+          </w:p>
+        </w:tc>
+        <w:tc>
+          <w:tcPr>
+            <w:tcW w:w="1560" w:type="dxa"/>
+          </w:tcPr>
+          <w:p>
+            <w:pPr/>
+            <w:r>
+              <w:t xml:space="preserve">Each of the 131 i-CLEANED crop and feed names → Mialyk crop (direct or proxy) and FAO-56 Table 12 entry with Kc</w:t>
+            </w:r>
+          </w:p>
+        </w:tc>
+        <w:tc>
+          <w:tcPr>
+            <w:tcW w:w="1560" w:type="dxa"/>
+          </w:tcPr>
+          <w:p>
+            <w:pPr/>
+            <w:r>
+              <w:t xml:space="preserve">–</w:t>
+            </w:r>
+          </w:p>
+        </w:tc>
+        <w:tc>
+          <w:tcPr>
+            <w:tcW w:w="1560" w:type="dxa"/>
+          </w:tcPr>
+          <w:p>
+            <w:pPr/>
+            <w:r>
+              <w:t xml:space="preserve">Tier choice, Eq. 1</w:t>
+            </w:r>
+          </w:p>
+        </w:tc>
+        <w:tc>
+          <w:tcPr>
+            <w:tcW w:w="1560" w:type="dxa"/>
+          </w:tcPr>
+          <w:p>
+            <w:pPr/>
+            <w:r>
+              <w:t xml:space="preserve">This work, following Mialyk et al. (2024) and Damerau (2024, Table 1)</w:t>
+            </w:r>
+          </w:p>
+        </w:tc>
+        <w:tc>
+          <w:tcPr>
+            <w:tcW w:w="1560" w:type="dxa"/>
+          </w:tcPr>
+          <w:p>
+            <w:pPr/>
+            <w:r>
+              <w:t xml:space="preserve">59 crops have Tier 1 (40 direct, 19 proxy); 72 forages, pastures and fodder trees use Tier 2</w:t>
+            </w:r>
+          </w:p>
+        </w:tc>
+      </w:tr>
+      <w:tr>
+        <w:tc>
+          <w:tcPr>
+            <w:tcW w:w="1560" w:type="dxa"/>
+          </w:tcPr>
+          <w:p>
+            <w:pPr/>
+            <w:r>
+              <w:t xml:space="preserve">fao56_table11_stage_lengths.csv</w:t>
+            </w:r>
+          </w:p>
+        </w:tc>
+        <w:tc>
+          <w:tcPr>
+            <w:tcW w:w="1560" w:type="dxa"/>
+          </w:tcPr>
+          <w:p>
+            <w:pPr/>
+            <w:r>
+              <w:t xml:space="preserve">Growth-stage lengths by crop and region</w:t>
+            </w:r>
+          </w:p>
+        </w:tc>
+        <w:tc>
+          <w:tcPr>
+            <w:tcW w:w="1560" w:type="dxa"/>
+          </w:tcPr>
+          <w:p>
+            <w:pPr/>
+            <w:r>
+              <w:t xml:space="preserve">days</w:t>
+            </w:r>
+          </w:p>
+        </w:tc>
+        <w:tc>
+          <w:tcPr>
+            <w:tcW w:w="1560" w:type="dxa"/>
+          </w:tcPr>
+          <w:p>
+            <w:pPr/>
+            <w:r>
+              <w:t xml:space="preserve">1</w:t>
+            </w:r>
+          </w:p>
+        </w:tc>
+        <w:tc>
+          <w:tcPr>
+            <w:tcW w:w="1560" w:type="dxa"/>
+          </w:tcPr>
+          <w:p>
+            <w:pPr/>
+            <w:r>
+              <w:t xml:space="preserve">FAO-56 Table 11 (Allen et al. 1998)</w:t>
+            </w:r>
+          </w:p>
+        </w:tc>
+        <w:tc>
+          <w:tcPr>
+            <w:tcW w:w="1560" w:type="dxa"/>
+          </w:tcPr>
+          <w:p>
+            <w:pPr/>
+            <w:r>
+              <w:t xml:space="preserve">167 rows; inconsistent source rows flagged</w:t>
+            </w:r>
+          </w:p>
+        </w:tc>
+      </w:tr>
+      <w:tr>
+        <w:tc>
+          <w:tcPr>
+            <w:tcW w:w="1560" w:type="dxa"/>
+          </w:tcPr>
+          <w:p>
+            <w:pPr/>
+            <w:r>
+              <w:t xml:space="preserve">fao56_table12_kc.csv</w:t>
+            </w:r>
+          </w:p>
+        </w:tc>
+        <w:tc>
+          <w:tcPr>
+            <w:tcW w:w="1560" w:type="dxa"/>
+          </w:tcPr>
+          <w:p>
+            <w:pPr/>
+            <w:r>
+              <w:t xml:space="preserve">Kc ini, mid, end (incl. grazing pasture)</w:t>
+            </w:r>
+          </w:p>
+        </w:tc>
+        <w:tc>
+          <w:tcPr>
+            <w:tcW w:w="1560" w:type="dxa"/>
+          </w:tcPr>
+          <w:p>
+            <w:pPr/>
+            <w:r>
+              <w:t xml:space="preserve">–</w:t>
+            </w:r>
+          </w:p>
+        </w:tc>
+        <w:tc>
+          <w:tcPr>
+            <w:tcW w:w="1560" w:type="dxa"/>
+          </w:tcPr>
+          <w:p>
+            <w:pPr/>
+            <w:r>
+              <w:t xml:space="preserve">1</w:t>
+            </w:r>
+          </w:p>
+        </w:tc>
+        <w:tc>
+          <w:tcPr>
+            <w:tcW w:w="1560" w:type="dxa"/>
+          </w:tcPr>
+          <w:p>
+            <w:pPr/>
+            <w:r>
+              <w:t xml:space="preserve">FAO-56 Table 12</w:t>
+            </w:r>
+          </w:p>
+        </w:tc>
+        <w:tc>
+          <w:tcPr>
+            <w:tcW w:w="1560" w:type="dxa"/>
+          </w:tcPr>
+          <w:p>
+            <w:pPr/>
+            <w:r>
+              <w:t xml:space="preserve">129 rows</w:t>
+            </w:r>
+          </w:p>
+        </w:tc>
+      </w:tr>
+      <w:tr>
+        <w:tc>
+          <w:tcPr>
+            <w:tcW w:w="1560" w:type="dxa"/>
+          </w:tcPr>
+          <w:p>
+            <w:pPr/>
+            <w:r>
+              <w:t xml:space="preserve">livestock_water_icleaned.csv</w:t>
+            </w:r>
+          </w:p>
+        </w:tc>
+        <w:tc>
+          <w:tcPr>
+            <w:tcW w:w="1560" w:type="dxa"/>
+          </w:tcPr>
+          <w:p>
+            <w:pPr/>
+            <w:r>
+              <w:t xml:space="preserve">Drinking and service water for the 22 i-CLEANED livestock types, grazing / mixed / industrial; feed mixing water 0.5 L per kg concentrate</w:t>
+            </w:r>
+          </w:p>
+        </w:tc>
+        <w:tc>
+          <w:tcPr>
+            <w:tcW w:w="1560" w:type="dxa"/>
+          </w:tcPr>
+          <w:p>
+            <w:pPr/>
+            <w:r>
+              <w:t xml:space="preserve">L/head/day</w:t>
+            </w:r>
+          </w:p>
+        </w:tc>
+        <w:tc>
+          <w:tcPr>
+            <w:tcW w:w="1560" w:type="dxa"/>
+          </w:tcPr>
+          <w:p>
+            <w:pPr/>
+            <w:r>
+              <w:t xml:space="preserve">16–17</w:t>
+            </w:r>
+          </w:p>
+        </w:tc>
+        <w:tc>
+          <w:tcPr>
+            <w:tcW w:w="1560" w:type="dxa"/>
+          </w:tcPr>
+          <w:p>
+            <w:pPr/>
+            <w:r>
+              <w:t xml:space="preserve">Chapagain and Hoekstra (2003), Tables 3.8–3.9, as used by Mekonnen and Hoekstra (2010)</w:t>
+            </w:r>
+          </w:p>
+        </w:tc>
+        <w:tc>
+          <w:tcPr>
+            <w:tcW w:w="1560" w:type="dxa"/>
+          </w:tcPr>
+          <w:p>
+            <w:pPr/>
+            <w:r>
+              <w:t xml:space="preserve">Buffalo, lambs, kids and growers use assumed mappings (flagged)</w:t>
+            </w:r>
+          </w:p>
+        </w:tc>
+      </w:tr>
+      <w:tr>
+        <w:tc>
+          <w:tcPr>
+            <w:tcW w:w="1560" w:type="dxa"/>
+          </w:tcPr>
+          <w:p>
+            <w:pPr/>
+            <w:r>
+              <w:t xml:space="preserve">irrigation_efficiency.csv</w:t>
+            </w:r>
+          </w:p>
+        </w:tc>
+        <w:tc>
+          <w:tcPr>
+            <w:tcW w:w="1560" w:type="dxa"/>
+          </w:tcPr>
+          <w:p>
+            <w:pPr/>
+            <w:r>
+              <w:t xml:space="preserve">Field application efficiency (surface 60%, sprinkler 75%, drip 90%); conveyance efficiency</w:t>
+            </w:r>
+          </w:p>
+        </w:tc>
+        <w:tc>
+          <w:tcPr>
+            <w:tcW w:w="1560" w:type="dxa"/>
+          </w:tcPr>
+          <w:p>
+            <w:pPr/>
+            <w:r>
+              <w:t xml:space="preserve">%</w:t>
+            </w:r>
+          </w:p>
+        </w:tc>
+        <w:tc>
+          <w:tcPr>
+            <w:tcW w:w="1560" w:type="dxa"/>
+          </w:tcPr>
+          <w:p>
+            <w:pPr/>
+            <w:r>
+              <w:t xml:space="preserve">15</w:t>
+            </w:r>
+          </w:p>
+        </w:tc>
+        <w:tc>
+          <w:tcPr>
+            <w:tcW w:w="1560" w:type="dxa"/>
+          </w:tcPr>
+          <w:p>
+            <w:pPr/>
+            <w:r>
+              <w:t xml:space="preserve">Brouwer et al. (1989), FAO Training Manual 4, Annex 1, Tables 7–8</w:t>
+            </w:r>
+          </w:p>
+        </w:tc>
+        <w:tc>
+          <w:tcPr>
+            <w:tcW w:w="1560" w:type="dxa"/>
+          </w:tcPr>
+          <w:p>
+            <w:pPr/>
+            <w:r>
+              <w:t xml:space="preserve">–</w:t>
+            </w:r>
+          </w:p>
+        </w:tc>
+      </w:tr>
+      <w:tr>
+        <w:tc>
+          <w:tcPr>
+            <w:tcW w:w="1560" w:type="dxa"/>
+          </w:tcPr>
+          <w:p>
+            <w:pPr/>
+            <w:r>
+              <w:t xml:space="preserve">water_availability_admin1_monthly.csv / _annual.csv</w:t>
+            </w:r>
+          </w:p>
+        </w:tc>
+        <w:tc>
+          <w:tcPr>
+            <w:tcW w:w="1560" w:type="dxa"/>
+          </w:tcPr>
+          <w:p>
+            <w:pPr/>
+            <w:r>
+              <w:t xml:space="preserve">Total availability (runoff + recharge), groundwater recharge, renewable availability (Damerau formula)</w:t>
+            </w:r>
+          </w:p>
+        </w:tc>
+        <w:tc>
+          <w:tcPr>
+            <w:tcW w:w="1560" w:type="dxa"/>
+          </w:tcPr>
+          <w:p>
+            <w:pPr/>
+            <w:r>
+              <w:t xml:space="preserve">m³/ha</w:t>
+            </w:r>
+          </w:p>
+        </w:tc>
+        <w:tc>
+          <w:tcPr>
+            <w:tcW w:w="1560" w:type="dxa"/>
+          </w:tcPr>
+          <w:p>
+            <w:pPr/>
+            <w:r>
+              <w:t xml:space="preserve">18</w:t>
+            </w:r>
+          </w:p>
+        </w:tc>
+        <w:tc>
+          <w:tcPr>
+            <w:tcW w:w="1560" w:type="dxa"/>
+          </w:tcPr>
+          <w:p>
+            <w:pPr/>
+            <w:r>
+              <w:t xml:space="preserve">WaterGAP 2.2e, ISIMIP3a, 1990–2019 means (Müller Schmied et al. 2023)</w:t>
+            </w:r>
+          </w:p>
+        </w:tc>
+        <w:tc>
+          <w:tcPr>
+            <w:tcW w:w="1560" w:type="dxa"/>
+          </w:tcPr>
+          <w:p>
+            <w:pPr/>
+            <w:r>
+              <w:t xml:space="preserve">All regions; 60 small islands or coastal regions filled from neighbours or the country mean</w:t>
+            </w:r>
+          </w:p>
+        </w:tc>
+      </w:tr>
+      <w:tr>
+        <w:tc>
+          <w:tcPr>
+            <w:tcW w:w="1560" w:type="dxa"/>
+          </w:tcPr>
+          <w:p>
+            <w:pPr/>
+            <w:r>
+              <w:t xml:space="preserve">water_stress_admin1_annual.csv / _monthly.csv</w:t>
+            </w:r>
+          </w:p>
+        </w:tc>
+        <w:tc>
+          <w:tcPr>
+            <w:tcW w:w="1560" w:type="dxa"/>
+          </w:tcPr>
+          <w:p>
+            <w:pPr/>
+            <w:r>
+              <w:t xml:space="preserve">Baseline water stress score and category; share "arid and low water use"</w:t>
+            </w:r>
+          </w:p>
+        </w:tc>
+        <w:tc>
+          <w:tcPr>
+            <w:tcW w:w="1560" w:type="dxa"/>
+          </w:tcPr>
+          <w:p>
+            <w:pPr/>
+            <w:r>
+              <w:t xml:space="preserve">–</w:t>
+            </w:r>
+          </w:p>
+        </w:tc>
+        <w:tc>
+          <w:tcPr>
+            <w:tcW w:w="1560" w:type="dxa"/>
+          </w:tcPr>
+          <w:p>
+            <w:pPr/>
+            <w:r>
+              <w:t xml:space="preserve">Section 10.6</w:t>
+            </w:r>
+          </w:p>
+        </w:tc>
+        <w:tc>
+          <w:tcPr>
+            <w:tcW w:w="1560" w:type="dxa"/>
+          </w:tcPr>
+          <w:p>
+            <w:pPr/>
+            <w:r>
+              <w:t xml:space="preserve">WRI Aqueduct 4.0 (Kuzma et al. 2023)</w:t>
+            </w:r>
+          </w:p>
+        </w:tc>
+        <w:tc>
+          <w:tcPr>
+            <w:tcW w:w="1560" w:type="dxa"/>
+          </w:tcPr>
+          <w:p>
+            <w:pPr/>
+            <w:r>
+              <w:t xml:space="preserve">All regions; 171 use the nearest basin</w:t>
+            </w:r>
+          </w:p>
+        </w:tc>
+      </w:tr>
+    </w:tbl>
+    <w:p>
+      <w:pPr>
+        <w:pStyle w:val="Heading3"/>
+      </w:pPr>
+      <w:r>
+        <w:t xml:space="preserve">A.2 Decisions taken while building the tables</w:t>
+      </w:r>
+    </w:p>
+    <w:p>
+      <w:pPr>
+        <w:pStyle w:val="ListParagraph"/>
+        <w:numPr>
+          <w:ilvl w:val="0"/>
+          <w:numId w:val="19"/>
+        </w:numPr>
+      </w:pPr>
+      <w:r>
+        <w:rPr>
+          <w:b/>
+        </w:rPr>
+        <w:t xml:space="preserve">Climate source.</w:t>
+      </w:r>
+      <w:r>
+        <w:t xml:space="preserve"> WorldClim 2.1 was used because the TerraClimate server was unreachable; the scripts can be switched later.</w:t>
+      </w:r>
+    </w:p>
+    <w:p>
+      <w:pPr>
+        <w:pStyle w:val="ListParagraph"/>
+        <w:numPr>
+          <w:ilvl w:val="0"/>
+          <w:numId w:val="19"/>
+        </w:numPr>
+      </w:pPr>
+      <w:r>
+        <w:rPr>
+          <w:b/>
+        </w:rPr>
+        <w:t xml:space="preserve">Green and blue from Mialyk.</w:t>
+      </w:r>
+      <w:r>
+        <w:t xml:space="preserve"> The public 43-crop file gives total water use per system only. Green irrigated = min(rainfed, irrigated) and blue = the difference, the Mekonnen and Hoekstra (2011) definition. Rainfed green includes capillary rise, which is below 1% nationally for most crops (column cr_share_national).</w:t>
+      </w:r>
+    </w:p>
+    <w:p>
+      <w:pPr>
+        <w:pStyle w:val="ListParagraph"/>
+        <w:numPr>
+          <w:ilvl w:val="0"/>
+          <w:numId w:val="19"/>
+        </w:numPr>
+      </w:pPr>
+      <w:r>
+        <w:rPr>
+          <w:b/>
+        </w:rPr>
+        <w:t xml:space="preserve">Data access.</w:t>
+      </w:r>
+      <w:r>
+        <w:t xml:space="preserve"> The 4TU repository was under maintenance; the Mialyk files were taken from Internet Archive copies of the 4TU files (identical file size) and should be re-checked against 4TU.</w:t>
+      </w:r>
+    </w:p>
+    <w:p>
+      <w:pPr>
+        <w:pStyle w:val="ListParagraph"/>
+        <w:numPr>
+          <w:ilvl w:val="0"/>
+          <w:numId w:val="19"/>
+        </w:numPr>
+      </w:pPr>
+      <w:r>
+        <w:rPr>
+          <w:b/>
+        </w:rPr>
+        <w:t xml:space="preserve">Arid basins.</w:t>
+      </w:r>
+      <w:r>
+        <w:t xml:space="preserve"> Aqueduct scores "arid and low water use" basins as 5. They are reported as their own category and excluded from the weighted score, so deserts are not labelled "extremely high" stress.</w:t>
+      </w:r>
+    </w:p>
+    <w:p>
+      <w:pPr>
+        <w:pStyle w:val="ListParagraph"/>
+        <w:numPr>
+          <w:ilvl w:val="0"/>
+          <w:numId w:val="19"/>
+        </w:numPr>
+      </w:pPr>
+      <w:r>
+        <w:rPr>
+          <w:b/>
+        </w:rPr>
+        <w:t xml:space="preserve">Drinking water.</w:t>
+      </w:r>
+      <w:r>
+        <w:t xml:space="preserve"> The legacy i-CLEANED value (120–160 L/day per cow) is two to three times the published drinking water (40–70 L/day). It is replaced by the Chapagain and Hoekstra table.</w:t>
+      </w:r>
+    </w:p>
+    <w:p>
+      <w:pPr>
+        <w:pStyle w:val="Heading3"/>
+      </w:pPr>
+      <w:r>
+        <w:t xml:space="preserve">A.3 Still needed from the team</w:t>
+      </w:r>
+    </w:p>
+    <w:tbl>
+      <w:tblPr>
+        <w:tblStyle w:val="TableGrid"/>
+        <w:tblW w:w="0" w:type="auto"/>
+        <w:tblLayout w:type="fixed"/>
+        <w:tblLook w:val="04A0" w:firstRow="1" w:lastRow="0" w:firstColumn="0" w:lastColumn="0" w:noHBand="0" w:noVBand="1"/>
+      </w:tblPr>
+      <w:tblGrid>
+        <w:gridCol w:w="3120"/>
+        <w:gridCol w:w="3120"/>
+        <w:gridCol w:w="3120"/>
+      </w:tblGrid>
+      <w:tr>
+        <w:trPr>
+          <w:tblHeader/>
+        </w:trPr>
+        <w:tc>
+          <w:tcPr>
+            <w:tcW w:w="3120" w:type="dxa"/>
+            <w:shd w:val="clear" w:color="auto" w:fill="F2F2F2"/>
+          </w:tcPr>
+          <w:p>
+            <w:pPr/>
+            <w:r>
+              <w:t xml:space="preserve">Item</w:t>
+            </w:r>
+          </w:p>
+        </w:tc>
+        <w:tc>
+          <w:tcPr>
+            <w:tcW w:w="3120" w:type="dxa"/>
+            <w:shd w:val="clear" w:color="auto" w:fill="F2F2F2"/>
+          </w:tcPr>
+          <w:p>
+            <w:pPr/>
+            <w:r>
+              <w:t xml:space="preserve">Why</w:t>
+            </w:r>
+          </w:p>
+        </w:tc>
+        <w:tc>
+          <w:tcPr>
+            <w:tcW w:w="3120" w:type="dxa"/>
+            <w:shd w:val="clear" w:color="auto" w:fill="F2F2F2"/>
+          </w:tcPr>
+          <w:p>
+            <w:pPr/>
+            <w:r>
+              <w:t xml:space="preserve">Suggestion</w:t>
+            </w:r>
+          </w:p>
+        </w:tc>
+      </w:tr>
+      <w:tr>
+        <w:tc>
+          <w:tcPr>
+            <w:tcW w:w="3120" w:type="dxa"/>
+          </w:tcPr>
+          <w:p>
+            <w:pPr/>
+            <w:r>
+              <w:t xml:space="preserve">Kc for 19 fodder trees and shrubs (e.g. Leucaena, Gliricidia, Calliandra, mulberry) and cactus</w:t>
+            </w:r>
+          </w:p>
+        </w:tc>
+        <w:tc>
+          <w:tcPr>
+            <w:tcW w:w="3120" w:type="dxa"/>
+          </w:tcPr>
+          <w:p>
+            <w:pPr/>
+            <w:r>
+              <w:t xml:space="preserve">No FAO-56 coefficient exists</w:t>
+            </w:r>
+          </w:p>
+        </w:tc>
+        <w:tc>
+          <w:tcPr>
+            <w:tcW w:w="3120" w:type="dxa"/>
+          </w:tcPr>
+          <w:p>
+            <w:pPr/>
+            <w:r>
+              <w:t xml:space="preserve">Expert values or literature review</w:t>
+            </w:r>
+          </w:p>
+        </w:tc>
+      </w:tr>
+      <w:tr>
+        <w:tc>
+          <w:tcPr>
+            <w:tcW w:w="3120" w:type="dxa"/>
+          </w:tcPr>
+          <w:p>
+            <w:pPr/>
+            <w:r>
+              <w:t xml:space="preserve">Residue price ratios π</w:t>
+            </w:r>
+          </w:p>
+        </w:tc>
+        <w:tc>
+          <w:tcPr>
+            <w:tcW w:w="3120" w:type="dxa"/>
+          </w:tcPr>
+          <w:p>
+            <w:pPr/>
+            <w:r>
+              <w:t xml:space="preserve">Only if economic allocation is kept</w:t>
+            </w:r>
+          </w:p>
+        </w:tc>
+        <w:tc>
+          <w:tcPr>
+            <w:tcW w:w="3120" w:type="dxa"/>
+          </w:tcPr>
+          <w:p>
+            <w:pPr/>
+            <w:r>
+              <w:t xml:space="preserve">Switch to ME-based allocation</w:t>
+            </w:r>
+          </w:p>
+        </w:tc>
+      </w:tr>
+      <w:tr>
+        <w:tc>
+          <w:tcPr>
+            <w:tcW w:w="3120" w:type="dxa"/>
+          </w:tcPr>
+          <w:p>
+            <w:pPr/>
+            <w:r>
+              <w:t xml:space="preserve">Utilization defaults</w:t>
+            </w:r>
+          </w:p>
+        </w:tc>
+        <w:tc>
+          <w:tcPr>
+            <w:tcW w:w="3120" w:type="dxa"/>
+          </w:tcPr>
+          <w:p>
+            <w:pPr/>
+            <w:r>
+              <w:t xml:space="preserve">Green water per kg grazed scales with 1/u</w:t>
+            </w:r>
+          </w:p>
+        </w:tc>
+        <w:tc>
+          <w:tcPr>
+            <w:tcW w:w="3120" w:type="dxa"/>
+          </w:tcPr>
+          <w:p>
+            <w:pPr/>
+            <w:r>
+              <w:t xml:space="preserve">Expert confirmation or field data</w:t>
+            </w:r>
+          </w:p>
+        </w:tc>
+      </w:tr>
+      <w:tr>
+        <w:tc>
+          <w:tcPr>
+            <w:tcW w:w="3120" w:type="dxa"/>
+          </w:tcPr>
+          <w:p>
+            <w:pPr/>
+            <w:r>
+              <w:t xml:space="preserve">Production system per livestock type</w:t>
+            </w:r>
+          </w:p>
+        </w:tc>
+        <w:tc>
+          <w:tcPr>
+            <w:tcW w:w="3120" w:type="dxa"/>
+          </w:tcPr>
+          <w:p>
+            <w:pPr/>
+            <w:r>
+              <w:t xml:space="preserve">Selects the drinking and service water column</w:t>
+            </w:r>
+          </w:p>
+        </w:tc>
+        <w:tc>
+          <w:tcPr>
+            <w:tcW w:w="3120" w:type="dxa"/>
+          </w:tcPr>
+          <w:p>
+            <w:pPr/>
+            <w:r>
+              <w:t xml:space="preserve">Default "mixed", or a user choice</w:t>
+            </w:r>
+          </w:p>
+        </w:tc>
+      </w:tr>
+      <w:tr>
+        <w:tc>
+          <w:tcPr>
+            <w:tcW w:w="3120" w:type="dxa"/>
+          </w:tcPr>
+          <w:p>
+            <w:pPr/>
+            <w:r>
+              <w:t xml:space="preserve">Renewable-water factor (0.45 as in Damerau 2024, or 0.55)</w:t>
+            </w:r>
+          </w:p>
+        </w:tc>
+        <w:tc>
+          <w:tcPr>
+            <w:tcW w:w="3120" w:type="dxa"/>
+          </w:tcPr>
+          <w:p>
+            <w:pPr/>
+            <w:r>
+              <w:t xml:space="preserve">In Rosa et al. (2018) the fractions appear to be environmental flow reserves</w:t>
+            </w:r>
+          </w:p>
+        </w:tc>
+        <w:tc>
+          <w:tcPr>
+            <w:tcW w:w="3120" w:type="dxa"/>
+          </w:tcPr>
+          <w:p>
+            <w:pPr/>
+            <w:r>
+              <w:t xml:space="preserve">Check Rosa et al. (2018), Table S1</w:t>
+            </w:r>
+          </w:p>
+        </w:tc>
+      </w:tr>
+      <w:tr>
+        <w:tc>
+          <w:tcPr>
+            <w:tcW w:w="3120" w:type="dxa"/>
+          </w:tcPr>
+          <w:p>
+            <w:pPr/>
+            <w:r>
+              <w:t xml:space="preserve">Review of assumed livestock mappings and proxy crops</w:t>
+            </w:r>
+          </w:p>
+        </w:tc>
+        <w:tc>
+          <w:tcPr>
+            <w:tcW w:w="3120" w:type="dxa"/>
+          </w:tcPr>
+          <w:p>
+            <w:pPr/>
+            <w:r>
+              <w:t xml:space="preserve">Buffalo, lambs, kids, growers; oats, lentils, cowpea, taro and others</w:t>
+            </w:r>
+          </w:p>
+        </w:tc>
+        <w:tc>
+          <w:tcPr>
+            <w:tcW w:w="3120" w:type="dxa"/>
+          </w:tcPr>
+          <w:p>
+            <w:pPr/>
+            <w:r>
+              <w:t xml:space="preserve">Expert review</w:t>
+            </w:r>
+          </w:p>
+        </w:tc>
+      </w:tr>
+    </w:tbl>
+    <w:p/>
     <w:sectPr>
       <w:pgSz w:w="12240" w:h="15840"/>
       <w:pgMar w:top="1440" w:right="1440" w:bottom="1440" w:left="1440" w:header="720" w:footer="720" w:gutter="0"/>
@@ -7734,6 +8956,9 @@
     </w:lvlOverride>
   </w:num>
   <w:num w:numId="18">
+    <w:abstractNumId w:val="0"/>
+  </w:num>
+  <w:num w:numId="19">
     <w:abstractNumId w:val="0"/>
   </w:num>
 </w:numbering>

</xml_diff>

<commit_message>
Switch crop-residue allocation to metabolizable energy (ME) basis
Co-Authored-By: Claude Opus 5.5 <noreply@anthropic.com>
Claude-Session: https://claude.ai/code/session_01GDeG8uxAFfNYAs7y3YT8qE
</commit_message>
<xml_diff>
--- a/Green_water_footprint_i-CLEANED_revised_methodology.docx
+++ b/Green_water_footprint_i-CLEANED_revised_methodology.docx
@@ -399,7 +399,7 @@
           <w:p>
             <w:pPr/>
             <w:r>
-              <w:t xml:space="preserve">ISO 14044 §4.3.4.2; prevents double counting. The basis (economic vs biophysical) is an open decision, see C</w:t>
+              <w:t xml:space="preserve">ISO 14044 §4.3.4.2; prevents double counting. Basis: ME content, biophysical as Damerau (2024) recommends and consistent with Allocation 2</w:t>
             </w:r>
           </w:p>
         </w:tc>
@@ -1002,7 +1002,7 @@
           <w:p>
             <w:pPr/>
             <w:r>
-              <w:t xml:space="preserve">Residue price ratio π by crop and country (if economic allocation is kept)</w:t>
+              <w:t xml:space="preserve">ME of main products that are not listed feeds (e.g. groundnut kernels), from Feedipedia</w:t>
             </w:r>
           </w:p>
         </w:tc>
@@ -1024,7 +1024,7 @@
           <w:p>
             <w:pPr/>
             <w:r>
-              <w:t xml:space="preserve">Pending: team input</w:t>
+              <w:t xml:space="preserve">Small new lookup</w:t>
             </w:r>
           </w:p>
         </w:tc>
@@ -1488,7 +1488,7 @@
           <w:p>
             <w:pPr/>
             <w:r>
-              <w:t xml:space="preserve">Local residue prices; local utilization; irrigation volume and method; measured ET; local climate</w:t>
+              <w:t xml:space="preserve">Local ME analyses; local prices (economic sensitivity only); local utilization; irrigation volume and method; measured ET; local climate</w:t>
             </w:r>
           </w:p>
         </w:tc>
@@ -1537,7 +1537,7 @@
         </w:numPr>
       </w:pPr>
       <w:r>
-        <w:t xml:space="preserve">Crop-residue allocation basis: economic (this draft) or biophysical. Damerau (2024) prefers biophysical, and an ME-based split would remove the need for a price table.</w:t>
+        <w:t xml:space="preserve">Crop-residue allocation basis: decided, ME content (Section 5); mass and economic remain sensitivity cases.</w:t>
       </w:r>
     </w:p>
     <w:p>
@@ -2444,40 +2444,40 @@
           <w:p>
             <w:pPr/>
             <w:r>
-              <w:t xml:space="preserve">pc,M, pc,R</w:t>
-            </w:r>
-          </w:p>
-        </w:tc>
-        <w:tc>
-          <w:tcPr>
-            <w:tcW w:w="2340" w:type="dxa"/>
-          </w:tcPr>
-          <w:p>
-            <w:pPr/>
-            <w:r>
-              <w:t xml:space="preserve">Farm-gate price of main product, of residue</w:t>
-            </w:r>
-          </w:p>
-        </w:tc>
-        <w:tc>
-          <w:tcPr>
-            <w:tcW w:w="2340" w:type="dxa"/>
-          </w:tcPr>
-          <w:p>
-            <w:pPr/>
-            <w:r>
-              <w:t xml:space="preserve">currency/t DM</w:t>
-            </w:r>
-          </w:p>
-        </w:tc>
-        <w:tc>
-          <w:tcPr>
-            <w:tcW w:w="2340" w:type="dxa"/>
-          </w:tcPr>
-          <w:p>
-            <w:pPr/>
-            <w:r>
-              <w:t xml:space="preserve">New input (default price ratio per crop)</w:t>
+              <w:t xml:space="preserve">MEc,M, MEc,R</w:t>
+            </w:r>
+          </w:p>
+        </w:tc>
+        <w:tc>
+          <w:tcPr>
+            <w:tcW w:w="2340" w:type="dxa"/>
+          </w:tcPr>
+          <w:p>
+            <w:pPr/>
+            <w:r>
+              <w:t xml:space="preserve">Metabolizable energy content of main product, of residue</w:t>
+            </w:r>
+          </w:p>
+        </w:tc>
+        <w:tc>
+          <w:tcPr>
+            <w:tcW w:w="2340" w:type="dxa"/>
+          </w:tcPr>
+          <w:p>
+            <w:pPr/>
+            <w:r>
+              <w:t xml:space="preserve">MJ/kg DM</w:t>
+            </w:r>
+          </w:p>
+        </w:tc>
+        <w:tc>
+          <w:tcPr>
+            <w:tcW w:w="2340" w:type="dxa"/>
+          </w:tcPr>
+          <w:p>
+            <w:pPr/>
+            <w:r>
+              <w:t xml:space="preserve">Existing (me_content); small lookup for main products that are not listed feeds</w:t>
             </w:r>
           </w:p>
         </w:tc>
@@ -3684,25 +3684,117 @@
     <w:p>
       <w:pPr/>
       <w:r>
-        <w:t xml:space="preserve">A crop's green water is split between its main product and its harvested residue by </w:t>
+        <w:t xml:space="preserve">A crop's green (and blue) water is split between its main product and its harvested residue in proportion to their </w:t>
       </w:r>
       <w:r>
         <w:rPr>
           <w:b/>
         </w:rPr>
-        <w:t xml:space="preserve">economic allocation</w:t>
-      </w:r>
-      <w:r>
-        <w:t xml:space="preserve"> (default), with </w:t>
-      </w:r>
+        <w:t xml:space="preserve">metabolizable energy (ME) content</w:t>
+      </w:r>
+      <w:r>
+        <w:t xml:space="preserve">. Mass and economic allocation are reported only as sensitivity cases. The split is applied once per crop and is fixed by what the crop produces, not by which items the herd happens to eat.</w:t>
+      </w:r>
+    </w:p>
+    <w:p>
+      <w:pPr>
+        <w:pStyle w:val="Heading3"/>
+      </w:pPr>
+      <w:r>
+        <w:t xml:space="preserve">5.1 Justification</w:t>
+      </w:r>
+    </w:p>
+    <w:p>
+      <w:pPr/>
+      <w:r>
+        <w:t xml:space="preserve">ISO 14044 (ISO 2006, §4.3.4.2) ranks the options: avoid allocation, then partition by a physical relationship or property, then by another relationship such as economic value. Allocation cannot be avoided: grain and stover come from the same plants, and system expansion would need a stable substitute for the residue, which smallholder systems lack. An energy basis is therefore preferred, for four reasons:</w:t>
+      </w:r>
+    </w:p>
+    <w:p>
+      <w:pPr>
+        <w:pStyle w:val="ListParagraph"/>
+        <w:numPr>
+          <w:ilvl w:val="0"/>
+          <w:numId w:val="7"/>
+        </w:numPr>
+      </w:pPr>
       <w:r>
         <w:rPr>
           <w:b/>
         </w:rPr>
-        <w:t xml:space="preserve">mass allocation</w:t>
-      </w:r>
-      <w:r>
-        <w:t xml:space="preserve"> reported as a sensitivity case. The split is applied once per crop. It is fixed by what the crop produces, not by which items the herd happens to eat.</w:t>
+        <w:t xml:space="preserve">Biophysical and stable.</w:t>
+      </w:r>
+      <w:r>
+        <w:t xml:space="preserve"> ME content does not move with market prices, so results stay comparable over time and between countries (Nemecek and Thoma 2020; Damerau 2024). Damerau (2024) recommends biophysical allocation for i-CLEANED, and grain-to-residue prices are rarely available in the Global South.</w:t>
+      </w:r>
+    </w:p>
+    <w:p>
+      <w:pPr>
+        <w:pStyle w:val="ListParagraph"/>
+        <w:numPr>
+          <w:ilvl w:val="0"/>
+          <w:numId w:val="7"/>
+        </w:numPr>
+      </w:pPr>
+      <w:r>
+        <w:rPr>
+          <w:b/>
+        </w:rPr>
+        <w:t xml:space="preserve">Tied to the function that matters here.</w:t>
+      </w:r>
+      <w:r>
+        <w:t xml:space="preserve"> In i-CLEANED the residue is valued as feed energy. Allocating by ME charges each product for the share of the crop's useful energy it carries.</w:t>
+      </w:r>
+    </w:p>
+    <w:p>
+      <w:pPr>
+        <w:pStyle w:val="ListParagraph"/>
+        <w:numPr>
+          <w:ilvl w:val="0"/>
+          <w:numId w:val="7"/>
+        </w:numPr>
+      </w:pPr>
+      <w:r>
+        <w:rPr>
+          <w:b/>
+        </w:rPr>
+        <w:t xml:space="preserve">Consistent with Allocation 2.</w:t>
+      </w:r>
+      <w:r>
+        <w:t xml:space="preserve"> The herd's co-products are already allocated by feed energy (Section 6), so the whole chain uses one physical basis.</w:t>
+      </w:r>
+    </w:p>
+    <w:p>
+      <w:pPr>
+        <w:pStyle w:val="ListParagraph"/>
+        <w:numPr>
+          <w:ilvl w:val="0"/>
+          <w:numId w:val="7"/>
+        </w:numPr>
+      </w:pPr>
+      <w:r>
+        <w:rPr>
+          <w:b/>
+        </w:rPr>
+        <w:t xml:space="preserve">No new user data.</w:t>
+      </w:r>
+      <w:r>
+        <w:t xml:space="preserve"> ME per kg DM is already stored for every feed item (</w:t>
+      </w:r>
+      <w:r>
+        <w:rPr>
+          <w:rStyle w:val="CodeChar"/>
+        </w:rPr>
+        <w:t xml:space="preserve">me_content</w:t>
+      </w:r>
+      <w:r>
+        <w:t xml:space="preserve">).</w:t>
+      </w:r>
+    </w:p>
+    <w:p>
+      <w:pPr/>
+      <w:r>
+        <w:t xml:space="preserve">Mass allocation is kept as a sensitivity case: it charges a bulky, low-energy residue most of the field's water. Economic allocation is offered only as an optional module where local farm-gate prices exist. Gross energy is not used, because it is nearly the same for grain and straw (about 18 MJ/kg DM), which would make the split almost identical to mass.</w:t>
       </w:r>
     </w:p>
     <w:p>
@@ -3710,68 +3802,12 @@
         <w:pStyle w:val="Heading3"/>
       </w:pPr>
       <w:r>
-        <w:t xml:space="preserve">5.1 Justification</w:t>
+        <w:t xml:space="preserve">5.2 Equations</w:t>
       </w:r>
     </w:p>
     <w:p>
       <w:pPr/>
       <w:r>
-        <w:t xml:space="preserve">ISO 14044 (ISO 2006, §4.3.4.2) ranks the options: avoid allocation, then partition by an underlying physical relationship, then by another relationship such as economic value. Neither of the first two applies:</w:t>
-      </w:r>
-    </w:p>
-    <w:p>
-      <w:pPr>
-        <w:pStyle w:val="ListParagraph"/>
-        <w:numPr>
-          <w:ilvl w:val="0"/>
-          <w:numId w:val="7"/>
-        </w:numPr>
-      </w:pPr>
-      <w:r>
-        <w:t xml:space="preserve">Subdivision is impossible, because grain and stover come from the same plants.</w:t>
-      </w:r>
-    </w:p>
-    <w:p>
-      <w:pPr>
-        <w:pStyle w:val="ListParagraph"/>
-        <w:numPr>
-          <w:ilvl w:val="0"/>
-          <w:numId w:val="7"/>
-        </w:numPr>
-      </w:pPr>
-      <w:r>
-        <w:t xml:space="preserve">System expansion would need a substitute for the residue, and in smallholder systems there is no stable one.</w:t>
-      </w:r>
-    </w:p>
-    <w:p>
-      <w:pPr>
-        <w:pStyle w:val="ListParagraph"/>
-        <w:numPr>
-          <w:ilvl w:val="0"/>
-          <w:numId w:val="7"/>
-        </w:numPr>
-      </w:pPr>
-      <w:r>
-        <w:t xml:space="preserve">No physical relationship causes the split. The crop is grown for its grain; the farmer does not increase stover output by changing the grain-to-straw ratio.</w:t>
-      </w:r>
-    </w:p>
-    <w:p>
-      <w:pPr/>
-      <w:r>
-        <w:t xml:space="preserve">Economic value reflects the reason the crop is grown, so it is the recommended basis. It is also the default for feed co-products in the FAO LEAP feed guidelines (FAO 2016a). The global water footprint datasets do not allocate between crop and residue: Mekonnen and Hoekstra (2011) charge all crop water to the crop (Damerau 2024). Damerau (2024) prefers biophysical allocation, so this default is an open decision (see the overview at the top). Mass allocation ignores why the crop is grown and charges a low-value, high-mass residue most of the field's water.</w:t>
-      </w:r>
-    </w:p>
-    <w:p>
-      <w:pPr>
-        <w:pStyle w:val="Heading3"/>
-      </w:pPr>
-      <w:r>
-        <w:t xml:space="preserve">5.2 Equations</w:t>
-      </w:r>
-    </w:p>
-    <w:p>
-      <w:pPr/>
-      <w:r>
         <w:t xml:space="preserve">With harvested outputs </w:t>
       </w:r>
       <w:r>
@@ -3790,13 +3826,13 @@
         <w:t xml:space="preserve">R</w:t>
       </w:r>
       <w:r>
-        <w:t xml:space="preserve"> = Y_R · r_R (t DM/ha) and farm-gate prices </w:t>
+        <w:t xml:space="preserve"> = Y_R · r_R (t DM/ha), and ME contents </w:t>
       </w:r>
       <w:r>
         <w:rPr>
           <w:i/>
         </w:rPr>
-        <w:t xml:space="preserve">p_M</w:t>
+        <w:t xml:space="preserve">ME_M</w:t>
       </w:r>
       <w:r>
         <w:t xml:space="preserve"> and </w:t>
@@ -3805,10 +3841,10 @@
         <w:rPr>
           <w:i/>
         </w:rPr>
-        <w:t xml:space="preserve">p_R</w:t>
-      </w:r>
-      <w:r>
-        <w:t xml:space="preserve"> (per t DM):</w:t>
+        <w:t xml:space="preserve">ME_R</w:t>
+      </w:r>
+      <w:r>
+        <w:t xml:space="preserve"> (MJ/kg DM):</w:t>
       </w:r>
     </w:p>
     <w:p>
@@ -3818,13 +3854,13 @@
       <w:bookmarkStart w:id="8" w:name="bongo_lang_latex_8"/>
       <w:bookmarkEnd w:id="8"/>
       <w:r>
-        <w:t xml:space="preserve">AF_{c,R}^{econ}=\frac{R\,p_R}{M\,p_M+R\,p_R},\qquad AF_{c,R}^{mass}=\frac{R}{M+R},\qquad AF_{c,M}=1-AF_{c,R}\qquad\text{(Eqs. 7–8)}</w:t>
+        <w:t xml:space="preserve">AF_{c,R}=\frac{R\,ME_R}{M\,ME_M+R\,ME_R},\qquad AF_{c,M}=1-AF_{c,R}\qquad\text{(Eqs. 7–8)}</w:t>
       </w:r>
     </w:p>
     <w:p>
       <w:pPr/>
       <w:r>
-        <w:t xml:space="preserve">The green water intensity of the residue, in m³/t DM, then follows from Eq. 6:</w:t>
+        <w:t xml:space="preserve">The green water intensity of the residue (m³/t DM) then follows from Eq. 6:</w:t>
       </w:r>
     </w:p>
     <w:p>
@@ -3834,22 +3870,120 @@
       <w:bookmarkStart w:id="9" w:name="bongo_lang_latex_9"/>
       <w:bookmarkEnd w:id="9"/>
       <w:r>
-        <w:t xml:space="preserve">WI_{c,R}=\frac{GWU_c\,AF_{c,R}}{R}=\frac{GWU_c\,p_R}{M\,p_M+R\,p_R}\qquad\text{(Eq. 9)}</w:t>
+        <w:t xml:space="preserve">WI_{c,R}=\frac{GWU_c\,AF_{c,R}}{R}=\frac{GWU_c\,ME_R}{M\,ME_M+R\,ME_R}\qquad\text{(Eq. 9)}</w:t>
       </w:r>
     </w:p>
     <w:p>
       <w:pPr/>
       <w:r>
-        <w:t xml:space="preserve">The economic factor only needs the </w:t>
-      </w:r>
+        <w:t xml:space="preserve">Sensitivity cases: mass, AF_R = R/(M + R); economic, AF_R = R·p_R/(M·p_M + R·p_R), only when local prices are entered.</w:t>
+      </w:r>
+    </w:p>
+    <w:p>
+      <w:pPr>
+        <w:pStyle w:val="Heading3"/>
+      </w:pPr>
+      <w:r>
+        <w:t xml:space="preserve">5.3 Rules</w:t>
+      </w:r>
+    </w:p>
+    <w:p>
+      <w:pPr>
+        <w:pStyle w:val="ListParagraph"/>
+        <w:numPr>
+          <w:ilvl w:val="0"/>
+          <w:numId w:val="8"/>
+        </w:numPr>
+      </w:pPr>
       <w:r>
         <w:rPr>
           <w:b/>
         </w:rPr>
-        <w:t xml:space="preserve">price ratio</w:t>
-      </w:r>
-      <w:r>
-        <w:t xml:space="preserve"> π = p_R / p_M, because absolute prices cancel. i-CLEANED should therefore store a default π per crop and region, and let the user overwrite it.</w:t>
+        <w:t xml:space="preserve">ME values.</w:t>
+      </w:r>
+      <w:r>
+        <w:t xml:space="preserve"> Use the </w:t>
+      </w:r>
+      <w:r>
+        <w:rPr>
+          <w:rStyle w:val="CodeChar"/>
+        </w:rPr>
+        <w:t xml:space="preserve">me_content</w:t>
+      </w:r>
+      <w:r>
+        <w:t xml:space="preserve"> of the residue item and of the main product as listed in the i-CLEANED feed table. Where the main product is not itself a listed feed (e.g. groundnut kernels, cotton seed, cocoyam), take its ME from a hosted default table (e.g. Feedipedia), flagged "assumed" until verified. Local analyses override defaults.</w:t>
+      </w:r>
+    </w:p>
+    <w:p>
+      <w:pPr>
+        <w:pStyle w:val="ListParagraph"/>
+        <w:numPr>
+          <w:ilvl w:val="0"/>
+          <w:numId w:val="8"/>
+        </w:numPr>
+      </w:pPr>
+      <w:r>
+        <w:rPr>
+          <w:b/>
+        </w:rPr>
+        <w:t xml:space="preserve">Unharvested residue</w:t>
+      </w:r>
+      <w:r>
+        <w:t xml:space="preserve"> (r_R = 0) carries no burden, and the main product takes AF_M = 1.</w:t>
+      </w:r>
+    </w:p>
+    <w:p>
+      <w:pPr>
+        <w:pStyle w:val="ListParagraph"/>
+        <w:numPr>
+          <w:ilvl w:val="0"/>
+          <w:numId w:val="8"/>
+        </w:numPr>
+      </w:pPr>
+      <w:r>
+        <w:rPr>
+          <w:b/>
+        </w:rPr>
+        <w:t xml:space="preserve">Closure.</w:t>
+      </w:r>
+      <w:r>
+        <w:t xml:space="preserve"> For each crop, AF_M + AF_R = 1 exactly. Grain and residue entered as separate feed items must reference the same crop record, so their factors are computed together. A residue item whose crop has no main yield or no main removal is invalid. The tool must ask for the values rather than silently assigning AF_R = 1, which is what it does today.</w:t>
+      </w:r>
+    </w:p>
+    <w:p>
+      <w:pPr>
+        <w:pStyle w:val="ListParagraph"/>
+        <w:numPr>
+          <w:ilvl w:val="0"/>
+          <w:numId w:val="8"/>
+        </w:numPr>
+      </w:pPr>
+      <w:r>
+        <w:rPr>
+          <w:b/>
+        </w:rPr>
+        <w:t xml:space="preserve">Purchased residue</w:t>
+      </w:r>
+      <w:r>
+        <w:t xml:space="preserve"> (e.g. bought stover) uses the seller's crop defaults for yields and the ME values of the items.</w:t>
+      </w:r>
+    </w:p>
+    <w:p>
+      <w:pPr>
+        <w:pStyle w:val="ListParagraph"/>
+        <w:numPr>
+          <w:ilvl w:val="0"/>
+          <w:numId w:val="8"/>
+        </w:numPr>
+      </w:pPr>
+      <w:r>
+        <w:rPr>
+          <w:b/>
+        </w:rPr>
+        <w:t xml:space="preserve">Same factor for green and blue.</w:t>
+      </w:r>
+      <w:r>
+        <w:t xml:space="preserve"> The allocation factor is a property of the crop, so it is applied unchanged to blue water (Section 10).</w:t>
       </w:r>
     </w:p>
     <w:p>
@@ -3857,120 +3991,13 @@
         <w:pStyle w:val="Heading3"/>
       </w:pPr>
       <w:r>
-        <w:t xml:space="preserve">5.3 Rules</w:t>
-      </w:r>
-    </w:p>
-    <w:p>
-      <w:pPr>
-        <w:pStyle w:val="ListParagraph"/>
-        <w:numPr>
-          <w:ilvl w:val="0"/>
-          <w:numId w:val="8"/>
-        </w:numPr>
-      </w:pPr>
-      <w:r>
-        <w:rPr>
-          <w:b/>
-        </w:rPr>
-        <w:t xml:space="preserve">Prices.</w:t>
-      </w:r>
-      <w:r>
-        <w:t xml:space="preserve"> Use local farm-gate prices per tonne of dry matter, averaged over 3–5 years to dampen volatility. Convert fresh-weight prices with the dry-matter contents already stored (</w:t>
-      </w:r>
-      <w:r>
-        <w:rPr>
-          <w:rStyle w:val="CodeChar"/>
-        </w:rPr>
-        <w:t xml:space="preserve">dm_content</w:t>
-      </w:r>
-      <w:r>
-        <w:t xml:space="preserve">).</w:t>
-      </w:r>
-    </w:p>
-    <w:p>
-      <w:pPr>
-        <w:pStyle w:val="ListParagraph"/>
-        <w:numPr>
-          <w:ilvl w:val="0"/>
-          <w:numId w:val="8"/>
-        </w:numPr>
-      </w:pPr>
-      <w:r>
-        <w:rPr>
-          <w:b/>
-        </w:rPr>
-        <w:t xml:space="preserve">Residues with no market.</w:t>
-      </w:r>
-      <w:r>
-        <w:t xml:space="preserve"> Where the residue is never traded, π is set from its opportunity value: the price per tonne DM of the cheapest locally traded roughage, scaled by the ratio of metabolizable energy (ME) contents. If no roughage is traded at all, use the regional default π and flag it "assumed". π = 0 is not allowed, because a residue the herd depends on is not worthless.</w:t>
-      </w:r>
-    </w:p>
-    <w:p>
-      <w:pPr>
-        <w:pStyle w:val="ListParagraph"/>
-        <w:numPr>
-          <w:ilvl w:val="0"/>
-          <w:numId w:val="8"/>
-        </w:numPr>
-      </w:pPr>
-      <w:r>
-        <w:rPr>
-          <w:b/>
-        </w:rPr>
-        <w:t xml:space="preserve">Unharvested residue</w:t>
-      </w:r>
-      <w:r>
-        <w:t xml:space="preserve"> (r_R = 0) carries no burden, and the main product takes AF_M = 1.</w:t>
-      </w:r>
-    </w:p>
-    <w:p>
-      <w:pPr>
-        <w:pStyle w:val="ListParagraph"/>
-        <w:numPr>
-          <w:ilvl w:val="0"/>
-          <w:numId w:val="8"/>
-        </w:numPr>
-      </w:pPr>
-      <w:r>
-        <w:rPr>
-          <w:b/>
-        </w:rPr>
-        <w:t xml:space="preserve">Closure.</w:t>
-      </w:r>
-      <w:r>
-        <w:t xml:space="preserve"> For each crop, AF_M + AF_R = 1 exactly. Grain and residue entered as separate feed items must reference the same crop record, so their factors are computed together. A residue item whose crop has no main yield or no main removal is invalid. The tool must ask for the values rather than silently assigning AF_R = 1, which is what it does today.</w:t>
-      </w:r>
-    </w:p>
-    <w:p>
-      <w:pPr>
-        <w:pStyle w:val="ListParagraph"/>
-        <w:numPr>
-          <w:ilvl w:val="0"/>
-          <w:numId w:val="8"/>
-        </w:numPr>
-      </w:pPr>
-      <w:r>
-        <w:rPr>
-          <w:b/>
-        </w:rPr>
-        <w:t xml:space="preserve">Purchased residue</w:t>
-      </w:r>
-      <w:r>
-        <w:t xml:space="preserve"> (e.g. bought stover) uses the seller's crop defaults and the regional π.</w:t>
-      </w:r>
-    </w:p>
-    <w:p>
-      <w:pPr>
-        <w:pStyle w:val="Heading3"/>
-      </w:pPr>
-      <w:r>
         <w:t xml:space="preserve">5.4 Worked example</w:t>
       </w:r>
     </w:p>
     <w:p>
       <w:pPr/>
       <w:r>
-        <w:t xml:space="preserve">Maize, Western Kenya lookup: Y_M = 1.06 and Y_R = 2.69 t DM/ha, r_M = 1.0, r_R = 0.7, so M = 1.06 and R = 1.88 t DM/ha. GWU = 4 000 m³/ha is illustrative only.</w:t>
+        <w:t xml:space="preserve">Maize, Western Kenya lookup: Y_M = 1.06 and Y_R = 2.69 t DM/ha, r_M = 1.0, r_R = 0.7, so M = 1.06 and R = 1.88 t DM/ha. ME from the i-CLEANED feed table: grain 13.5 MJ/kg DM, stover 9.13 MJ/kg DM. GWU = 4 000 m³/ha is illustrative only.</w:t>
       </w:r>
     </w:p>
     <w:tbl>
@@ -4069,7 +4096,7 @@
           <w:p>
             <w:pPr/>
             <w:r>
-              <w:t xml:space="preserve">Mass (Eq. 8)</w:t>
+              <w:t xml:space="preserve">Mass (sensitivity)</w:t>
             </w:r>
           </w:p>
         </w:tc>
@@ -4104,6 +4131,85 @@
           <w:p>
             <w:pPr/>
             <w:r>
+              <w:rPr>
+                <w:b/>
+              </w:rPr>
+              <w:t xml:space="preserve">ME (default)</w:t>
+            </w:r>
+          </w:p>
+        </w:tc>
+        <w:tc>
+          <w:tcPr>
+            <w:tcW w:w="3120" w:type="dxa"/>
+          </w:tcPr>
+          <w:p>
+            <w:pPr/>
+            <w:r>
+              <w:rPr>
+                <w:b/>
+              </w:rPr>
+              <w:t xml:space="preserve">0.55</w:t>
+            </w:r>
+          </w:p>
+        </w:tc>
+        <w:tc>
+          <w:tcPr>
+            <w:tcW w:w="3120" w:type="dxa"/>
+          </w:tcPr>
+          <w:p>
+            <w:pPr/>
+            <w:r>
+              <w:rPr>
+                <w:b/>
+              </w:rPr>
+              <w:t xml:space="preserve">1 159</w:t>
+            </w:r>
+          </w:p>
+        </w:tc>
+      </w:tr>
+      <w:tr>
+        <w:tc>
+          <w:tcPr>
+            <w:tcW w:w="3120" w:type="dxa"/>
+          </w:tcPr>
+          <w:p>
+            <w:pPr/>
+            <w:r>
+              <w:t xml:space="preserve">ME, low-quality stover (6.9 MJ/kg DM, also in the i-CLEANED tables)</w:t>
+            </w:r>
+          </w:p>
+        </w:tc>
+        <w:tc>
+          <w:tcPr>
+            <w:tcW w:w="3120" w:type="dxa"/>
+          </w:tcPr>
+          <w:p>
+            <w:pPr/>
+            <w:r>
+              <w:t xml:space="preserve">0.48</w:t>
+            </w:r>
+          </w:p>
+        </w:tc>
+        <w:tc>
+          <w:tcPr>
+            <w:tcW w:w="3120" w:type="dxa"/>
+          </w:tcPr>
+          <w:p>
+            <w:pPr/>
+            <w:r>
+              <w:t xml:space="preserve">1 011</w:t>
+            </w:r>
+          </w:p>
+        </w:tc>
+      </w:tr>
+      <w:tr>
+        <w:tc>
+          <w:tcPr>
+            <w:tcW w:w="3120" w:type="dxa"/>
+          </w:tcPr>
+          <w:p>
+            <w:pPr/>
+            <w:r>
               <w:t xml:space="preserve">Current code (mass share applied twice)</w:t>
             </w:r>
           </w:p>
@@ -4139,42 +4245,7 @@
           <w:p>
             <w:pPr/>
             <w:r>
-              <w:t xml:space="preserve">Economic, π = 0.20</w:t>
-            </w:r>
-          </w:p>
-        </w:tc>
-        <w:tc>
-          <w:tcPr>
-            <w:tcW w:w="3120" w:type="dxa"/>
-          </w:tcPr>
-          <w:p>
-            <w:pPr/>
-            <w:r>
-              <w:t xml:space="preserve">0.26</w:t>
-            </w:r>
-          </w:p>
-        </w:tc>
-        <w:tc>
-          <w:tcPr>
-            <w:tcW w:w="3120" w:type="dxa"/>
-          </w:tcPr>
-          <w:p>
-            <w:pPr/>
-            <w:r>
-              <w:t xml:space="preserve">557</w:t>
-            </w:r>
-          </w:p>
-        </w:tc>
-      </w:tr>
-      <w:tr>
-        <w:tc>
-          <w:tcPr>
-            <w:tcW w:w="3120" w:type="dxa"/>
-          </w:tcPr>
-          <w:p>
-            <w:pPr/>
-            <w:r>
-              <w:t xml:space="preserve">Economic, π = 0.10 (default proposal)</w:t>
+              <w:t xml:space="preserve">Economic, price ratio 0.10 (sensitivity, local prices only)</w:t>
             </w:r>
           </w:p>
         </w:tc>
@@ -4205,7 +4276,7 @@
     <w:p>
       <w:pPr/>
       <w:r>
-        <w:t xml:space="preserve">The choice of basis changes the residue's green water intensity by a factor of about 4 to 7. This is why the allocation factor and π must be reported with every result.</w:t>
+        <w:t xml:space="preserve">The ME basis places the residue close to, but below, the mass result, because stover carries less energy per kg than grain. The economic basis would charge it about a quarter as much. This spread is why the basis and AF_R must be reported with every result.</w:t>
       </w:r>
     </w:p>
     <w:p>
@@ -5116,7 +5187,7 @@
         </w:numPr>
       </w:pPr>
       <w:r>
-        <w:t xml:space="preserve">Allocation 1: basis, π per crop and AF_R per crop.</w:t>
+        <w:t xml:space="preserve">Allocation 1: basis, ME values and AF_R per crop.</w:t>
       </w:r>
     </w:p>
     <w:p>
@@ -5202,7 +5273,7 @@
     <w:p>
       <w:pPr/>
       <w:r>
-        <w:t xml:space="preserve">Four parameters dominate the green water footprint: feed intake, feed yield, pasture utilization and the residue price ratio. Each result must be accompanied by a sensitivity analysis on these, and by a data-quality flag on every default.</w:t>
+        <w:t xml:space="preserve">Four parameters dominate the green water footprint: feed intake, feed yield, pasture utilization and the residue allocation basis. Each result must be accompanied by a sensitivity analysis on these, and by a data-quality flag on every default.</w:t>
       </w:r>
     </w:p>
     <w:p>
@@ -5451,7 +5522,7 @@
           <w:p>
             <w:pPr/>
             <w:r>
-              <w:t xml:space="preserve">Residue price ratio π</w:t>
+              <w:t xml:space="preserve">Residue ME content</w:t>
             </w:r>
           </w:p>
         </w:tc>
@@ -5462,7 +5533,7 @@
           <w:p>
             <w:pPr/>
             <w:r>
-              <w:t xml:space="preserve">0.05</w:t>
+              <w:t xml:space="preserve">−20%</w:t>
             </w:r>
           </w:p>
         </w:tc>
@@ -5473,7 +5544,7 @@
           <w:p>
             <w:pPr/>
             <w:r>
-              <w:t xml:space="preserve">crop default</w:t>
+              <w:t xml:space="preserve">feed table</w:t>
             </w:r>
           </w:p>
         </w:tc>
@@ -5484,7 +5555,7 @@
           <w:p>
             <w:pPr/>
             <w:r>
-              <w:t xml:space="preserve">0.30</w:t>
+              <w:t xml:space="preserve">+20%</w:t>
             </w:r>
           </w:p>
         </w:tc>
@@ -5495,7 +5566,7 @@
           <w:p>
             <w:pPr/>
             <w:r>
-              <w:t xml:space="preserve">Near-linear in π when πR ≪ M</w:t>
+              <w:t xml:space="preserve">Moderate (Section 5.4)</w:t>
             </w:r>
           </w:p>
         </w:tc>
@@ -5747,7 +5818,7 @@
           <w:p>
             <w:pPr/>
             <w:r>
-              <w:t xml:space="preserve">economic</w:t>
+              <w:t xml:space="preserve">economic (local prices)</w:t>
             </w:r>
           </w:p>
         </w:tc>
@@ -5758,7 +5829,7 @@
           <w:p>
             <w:pPr/>
             <w:r>
-              <w:t xml:space="preserve">economic</w:t>
+              <w:t xml:space="preserve">ME</w:t>
             </w:r>
           </w:p>
         </w:tc>
@@ -6085,7 +6156,7 @@
           <w:p>
             <w:pPr/>
             <w:r>
-              <w:t xml:space="preserve">One allocation step, economic default</w:t>
+              <w:t xml:space="preserve">One allocation step, ME-based</w:t>
             </w:r>
           </w:p>
         </w:tc>
@@ -6528,7 +6599,7 @@
         </w:numPr>
       </w:pPr>
       <w:r>
-        <w:t xml:space="preserve">a residue price ratio per crop (lookup table, editable).</w:t>
+        <w:t xml:space="preserve">ME of main products that are not listed feeds (small lookup table, editable).</w:t>
       </w:r>
     </w:p>
     <w:p>
@@ -7121,10 +7192,10 @@
         <w:rPr>
           <w:b/>
         </w:rPr>
-        <w:t xml:space="preserve">Residue price ratios:</w:t>
-      </w:r>
-      <w:r>
-        <w:t xml:space="preserve"> who compiles π per crop and country, and from which price sources?</w:t>
+        <w:t xml:space="preserve">Main-product ME values:</w:t>
+      </w:r>
+      <w:r>
+        <w:t xml:space="preserve"> confirm the ME defaults for main products that are not listed feeds.</w:t>
       </w:r>
     </w:p>
     <w:p>
@@ -7469,6 +7540,18 @@
       </w:pPr>
       <w:r>
         <w:t xml:space="preserve">Müller Schmied H, Träutlein T, Ackermann S et al. (2023) The global water resources and use model WaterGAP v2.2e: description and evaluation of modifications and new features. Geoscientific Model Development Discussions, preprint.</w:t>
+      </w:r>
+    </w:p>
+    <w:p>
+      <w:pPr>
+        <w:pStyle w:val="ListParagraph"/>
+        <w:numPr>
+          <w:ilvl w:val="0"/>
+          <w:numId w:val="18"/>
+        </w:numPr>
+      </w:pPr>
+      <w:r>
+        <w:t xml:space="preserve">Nemecek T, Thoma G (2020) Allocation between milk and meat in dairy LCA: critical discussion of the International Dairy Federation's standard methodology. 12th International Conference on Life Cycle Assessment of Food (LCA Food 2020), Berlin (virtual).</w:t>
       </w:r>
     </w:p>
     <w:p>
@@ -8539,29 +8622,29 @@
           <w:p>
             <w:pPr/>
             <w:r>
-              <w:t xml:space="preserve">Residue price ratios π</w:t>
-            </w:r>
-          </w:p>
-        </w:tc>
-        <w:tc>
-          <w:tcPr>
-            <w:tcW w:w="3120" w:type="dxa"/>
-          </w:tcPr>
-          <w:p>
-            <w:pPr/>
-            <w:r>
-              <w:t xml:space="preserve">Only if economic allocation is kept</w:t>
-            </w:r>
-          </w:p>
-        </w:tc>
-        <w:tc>
-          <w:tcPr>
-            <w:tcW w:w="3120" w:type="dxa"/>
-          </w:tcPr>
-          <w:p>
-            <w:pPr/>
-            <w:r>
-              <w:t xml:space="preserve">Switch to ME-based allocation</w:t>
+              <w:t xml:space="preserve">ME of main products that are not listed feeds</w:t>
+            </w:r>
+          </w:p>
+        </w:tc>
+        <w:tc>
+          <w:tcPr>
+            <w:tcW w:w="3120" w:type="dxa"/>
+          </w:tcPr>
+          <w:p>
+            <w:pPr/>
+            <w:r>
+              <w:t xml:space="preserve">Needed for ME-based residue allocation (Section 5)</w:t>
+            </w:r>
+          </w:p>
+        </w:tc>
+        <w:tc>
+          <w:tcPr>
+            <w:tcW w:w="3120" w:type="dxa"/>
+          </w:tcPr>
+          <w:p>
+            <w:pPr/>
+            <w:r>
+              <w:t xml:space="preserve">Feedipedia or national feed tables</w:t>
             </w:r>
           </w:p>
         </w:tc>

</xml_diff>

<commit_message>
Add main-product ME lookup from Feedipedia for ME-based residue allocation
Co-Authored-By: Claude Opus 5.5 <noreply@anthropic.com>
Claude-Session: https://claude.ai/code/session_01GDeG8uxAFfNYAs7y3YT8qE
</commit_message>
<xml_diff>
--- a/Green_water_footprint_i-CLEANED_revised_methodology.docx
+++ b/Green_water_footprint_i-CLEANED_revised_methodology.docx
@@ -1002,7 +1002,7 @@
           <w:p>
             <w:pPr/>
             <w:r>
-              <w:t xml:space="preserve">ME of main products that are not listed feeds (e.g. groundnut kernels), from Feedipedia</w:t>
+              <w:t xml:space="preserve">ME of main products of residue-bearing crops (Feedipedia)</w:t>
             </w:r>
           </w:p>
         </w:tc>
@@ -1024,7 +1024,7 @@
           <w:p>
             <w:pPr/>
             <w:r>
-              <w:t xml:space="preserve">Small new lookup</w:t>
+              <w:t xml:space="preserve">Built: 31 products (Annex A)</w:t>
             </w:r>
           </w:p>
         </w:tc>
@@ -3911,7 +3911,7 @@
         <w:t xml:space="preserve">me_content</w:t>
       </w:r>
       <w:r>
-        <w:t xml:space="preserve"> of the residue item and of the main product as listed in the i-CLEANED feed table. Where the main product is not itself a listed feed (e.g. groundnut kernels, cotton seed, cocoyam), take its ME from a hosted default table (e.g. Feedipedia), flagged "assumed" until verified. Local analyses override defaults.</w:t>
+        <w:t xml:space="preserve"> of the residue item and of the main product as listed in the i-CLEANED feed table. Where the main product is not itself a listed feed (e.g. groundnut kernels, cotton seed, cocoyam), take its ME from the hosted table main_product_me.csv (Feedipedia, ME for ruminants; Annex A). For example: maize grain 13.6, paddy rice 10.1, groundnut pods 18.2, cassava roots 12.4 MJ/kg DM. Local analyses override defaults.</w:t>
       </w:r>
     </w:p>
     <w:p>
@@ -7395,6 +7395,18 @@
         </w:numPr>
       </w:pPr>
       <w:r>
+        <w:t xml:space="preserve">Feedipedia (2012–2024) Animal feed resources information system. INRAE, CIRAD, AFZ and FAO. https://www.feedipedia.org (datasheets cited by node in main_product_me.csv; accessed 8 October 2026).</w:t>
+      </w:r>
+    </w:p>
+    <w:p>
+      <w:pPr>
+        <w:pStyle w:val="ListParagraph"/>
+        <w:numPr>
+          <w:ilvl w:val="0"/>
+          <w:numId w:val="18"/>
+        </w:numPr>
+      </w:pPr>
+      <w:r>
         <w:t xml:space="preserve">GADM (2022) Database of Global Administrative Areas, version 4.1. University of California, Berkeley.</w:t>
       </w:r>
     </w:p>
@@ -7625,7 +7637,7 @@
     <w:p>
       <w:pPr/>
       <w:r>
-        <w:t xml:space="preserve">i-CLEANED hosts ten parameter tables, so users do not enter them. All are built, for 2,620 GADM 4.1 level-1 regions in 166 countries of the Global South where the data are spatial. They are stored with their build scripts in the repository folder </w:t>
+        <w:t xml:space="preserve">i-CLEANED hosts eleven parameter tables, so users do not enter them. All are built, for 2,620 GADM 4.1 level-1 regions in 166 countries of the Global South where the data are spatial. They are stored with their build scripts in the repository folder </w:t>
       </w:r>
       <w:hyperlink r:id="rId3" w:history="1">
         <w:r>
@@ -8019,6 +8031,74 @@
           <w:p>
             <w:pPr/>
             <w:r>
+              <w:t xml:space="preserve">main_product_me.csv</w:t>
+            </w:r>
+          </w:p>
+        </w:tc>
+        <w:tc>
+          <w:tcPr>
+            <w:tcW w:w="1560" w:type="dxa"/>
+          </w:tcPr>
+          <w:p>
+            <w:pPr/>
+            <w:r>
+              <w:t xml:space="preserve">ME (ruminants) of the main product of 31 residue-bearing crops, with Feedipedia table, DM, SD and the i-CLEANED crop names served</w:t>
+            </w:r>
+          </w:p>
+        </w:tc>
+        <w:tc>
+          <w:tcPr>
+            <w:tcW w:w="1560" w:type="dxa"/>
+          </w:tcPr>
+          <w:p>
+            <w:pPr/>
+            <w:r>
+              <w:t xml:space="preserve">MJ/kg DM</w:t>
+            </w:r>
+          </w:p>
+        </w:tc>
+        <w:tc>
+          <w:tcPr>
+            <w:tcW w:w="1560" w:type="dxa"/>
+          </w:tcPr>
+          <w:p>
+            <w:pPr/>
+            <w:r>
+              <w:t xml:space="preserve">7–8</w:t>
+            </w:r>
+          </w:p>
+        </w:tc>
+        <w:tc>
+          <w:tcPr>
+            <w:tcW w:w="1560" w:type="dxa"/>
+          </w:tcPr>
+          <w:p>
+            <w:pPr/>
+            <w:r>
+              <w:t xml:space="preserve">Feedipedia (INRAE, CIRAD, AFZ, FAO), "ME ruminants" rows</w:t>
+            </w:r>
+          </w:p>
+        </w:tc>
+        <w:tc>
+          <w:tcPr>
+            <w:tcW w:w="1560" w:type="dxa"/>
+          </w:tcPr>
+          <w:p>
+            <w:pPr/>
+            <w:r>
+              <w:t xml:space="preserve">27 direct, 2 proxy (taro for cocoyam, sugar beet for fodder beet); tomato fruits and whole sesame seeds have no published ME</w:t>
+            </w:r>
+          </w:p>
+        </w:tc>
+      </w:tr>
+      <w:tr>
+        <w:tc>
+          <w:tcPr>
+            <w:tcW w:w="1560" w:type="dxa"/>
+          </w:tcPr>
+          <w:p>
+            <w:pPr/>
+            <w:r>
               <w:t xml:space="preserve">fao56_table11_stage_lengths.csv</w:t>
             </w:r>
           </w:p>
@@ -8622,29 +8702,29 @@
           <w:p>
             <w:pPr/>
             <w:r>
-              <w:t xml:space="preserve">ME of main products that are not listed feeds</w:t>
-            </w:r>
-          </w:p>
-        </w:tc>
-        <w:tc>
-          <w:tcPr>
-            <w:tcW w:w="3120" w:type="dxa"/>
-          </w:tcPr>
-          <w:p>
-            <w:pPr/>
-            <w:r>
-              <w:t xml:space="preserve">Needed for ME-based residue allocation (Section 5)</w:t>
-            </w:r>
-          </w:p>
-        </w:tc>
-        <w:tc>
-          <w:tcPr>
-            <w:tcW w:w="3120" w:type="dxa"/>
-          </w:tcPr>
-          <w:p>
-            <w:pPr/>
-            <w:r>
-              <w:t xml:space="preserve">Feedipedia or national feed tables</w:t>
+              <w:t xml:space="preserve">ME for tomato fruits and whole sesame seeds</w:t>
+            </w:r>
+          </w:p>
+        </w:tc>
+        <w:tc>
+          <w:tcPr>
+            <w:tcW w:w="3120" w:type="dxa"/>
+          </w:tcPr>
+          <w:p>
+            <w:pPr/>
+            <w:r>
+              <w:t xml:space="preserve">No value published in Feedipedia</w:t>
+            </w:r>
+          </w:p>
+        </w:tc>
+        <w:tc>
+          <w:tcPr>
+            <w:tcW w:w="3120" w:type="dxa"/>
+          </w:tcPr>
+          <w:p>
+            <w:pPr/>
+            <w:r>
+              <w:t xml:space="preserve">Expert value or local analysis</w:t>
             </w:r>
           </w:p>
         </w:tc>

</xml_diff>

<commit_message>
Correct sustainable water availability (Pastor VMF), add tested R reference implementation and Study_1 comparison
Co-Authored-By: Claude Opus 5.5 <noreply@anthropic.com>
Claude-Session: https://claude.ai/code/session_01GDeG8uxAFfNYAs7y3YT8qE
</commit_message>
<xml_diff>
--- a/Green_water_footprint_i-CLEANED_revised_methodology.docx
+++ b/Green_water_footprint_i-CLEANED_revised_methodology.docx
@@ -5901,7 +5901,18 @@
     <w:p>
       <w:pPr/>
       <w:r>
-        <w:t xml:space="preserve">The current code (CIAT/cleaned v0.7.0, called by CIAT/icleaned) differs from this methodology in nine places. They were found by reading the code, not by running it. Each must be confirmed on Study_1 with a hand calculation before it is fixed.</w:t>
+        <w:t xml:space="preserve">The current code (CIAT/cleaned v0.7.0, called by CIAT/icleaned) differs from this methodology in ten places. Items 1–9 were found by reading the code; running it on Study_1 confirmed items 2 and 4 and found item 10. A tested reference implementation of the whole methodology in R, with a Study_1 comparison, is in the repository folder </w:t>
+      </w:r>
+      <w:hyperlink r:id="rId3" w:history="1">
+        <w:r>
+          <w:rPr>
+            <w:rStyle w:val="Hyperlink"/>
+          </w:rPr>
+          <w:t xml:space="preserve">water_parameters/R</w:t>
+        </w:r>
+      </w:hyperlink>
+      <w:r>
+        <w:t xml:space="preserve"> (file STUDY1_RESULTS.md).</w:t>
       </w:r>
     </w:p>
     <w:tbl>
@@ -6538,6 +6549,63 @@
           </w:p>
         </w:tc>
       </w:tr>
+      <w:tr>
+        <w:tc>
+          <w:tcPr>
+            <w:tcW w:w="1872" w:type="dxa"/>
+          </w:tcPr>
+          <w:p>
+            <w:pPr/>
+            <w:r>
+              <w:t xml:space="preserve">10</w:t>
+            </w:r>
+          </w:p>
+        </w:tc>
+        <w:tc>
+          <w:tcPr>
+            <w:tcW w:w="1872" w:type="dxa"/>
+          </w:tcPr>
+          <w:p>
+            <w:pPr/>
+            <w:r>
+              <w:t xml:space="preserve">energy_requirement.R</w:t>
+            </w:r>
+          </w:p>
+        </w:tc>
+        <w:tc>
+          <w:tcPr>
+            <w:tcW w:w="1872" w:type="dxa"/>
+          </w:tcPr>
+          <w:p>
+            <w:pPr/>
+            <w:r>
+              <w:t xml:space="preserve">Growth energy (IPCC Eq. 10.6) divides by adult_weight; when it is 0 (Study_1 steers) the Inf is silently set to 0, so growing animals get no growth energy</w:t>
+            </w:r>
+          </w:p>
+        </w:tc>
+        <w:tc>
+          <w:tcPr>
+            <w:tcW w:w="1872" w:type="dxa"/>
+          </w:tcPr>
+          <w:p>
+            <w:pPr/>
+            <w:r>
+              <w:t xml:space="preserve">Validate adult_weight on input; fall back to the herd's adult weight and flag it</w:t>
+            </w:r>
+          </w:p>
+        </w:tc>
+        <w:tc>
+          <w:tcPr>
+            <w:tcW w:w="1872" w:type="dxa"/>
+          </w:tcPr>
+          <w:p>
+            <w:pPr/>
+            <w:r>
+              <w:t xml:space="preserve">6</w:t>
+            </w:r>
+          </w:p>
+        </w:tc>
+      </w:tr>
     </w:tbl>
     <w:p>
       <w:pPr/>
@@ -7029,7 +7097,7 @@
         <w:t xml:space="preserve">Quantitative:</w:t>
       </w:r>
       <w:r>
-        <w:t xml:space="preserve"> renewable water availability per hectare, from 30-year monthly means of surface runoff plus groundwater recharge (WaterGAP 2.2e; Müller Schmied et al. 2023), with the renewable fraction from Rosa et al. (2018):</w:t>
+        <w:t xml:space="preserve"> sustainable water availability per hectare. This is the 30-year monthly mean of surface runoff plus groundwater recharge (WaterGAP 2.2e; Müller Schmied et al. 2023) minus environmental flow requirements by the Variable Monthly Flow method (Pastor et al. 2014), as in Rosa et al. (2018): 60% of flow is reserved in low-flow months, 45% in intermediate months and 30% in high-flow months. Damerau's (2024) factor of 0.45 equals the average reserved share, so it is not used as the available share:</w:t>
       </w:r>
     </w:p>
     <w:p>
@@ -7039,7 +7107,7 @@
       <w:bookmarkStart w:id="18" w:name="bongo_lang_latex_18"/>
       <w:bookmarkEnd w:id="18"/>
       <w:r>
-        <w:t xml:space="preserve">RWD=\frac{B_{herd}/A_{farm}}{RenWatAvail_{ha}}\qquad\text{(Eq. 18)}</w:t>
+        <w:t xml:space="preserve">RWD=\frac{B_{herd}/A_{farm}}{SustWatAvail_{ha}}\qquad\text{(Eq. 18)}</w:t>
       </w:r>
     </w:p>
     <w:p>
@@ -7587,6 +7655,18 @@
         </w:numPr>
       </w:pPr>
       <w:r>
+        <w:t xml:space="preserve">Pastor AV, Ludwig F, Biemans H, Hoff H, Kabat P (2014) Accounting for environmental flow requirements in global water assessments. Hydrology and Earth System Sciences 18:5041–5059.</w:t>
+      </w:r>
+    </w:p>
+    <w:p>
+      <w:pPr>
+        <w:pStyle w:val="ListParagraph"/>
+        <w:numPr>
+          <w:ilvl w:val="0"/>
+          <w:numId w:val="18"/>
+        </w:numPr>
+      </w:pPr>
+      <w:r>
         <w:t xml:space="preserve">Rosa L, Rulli MC, Davis KF et al. (2018) Closing the yield gap while ensuring water sustainability. Environmental Research Letters 13:104002.</w:t>
       </w:r>
     </w:p>
@@ -7639,7 +7719,7 @@
       <w:r>
         <w:t xml:space="preserve">i-CLEANED hosts eleven parameter tables, so users do not enter them. All are built, for 2,620 GADM 4.1 level-1 regions in 166 countries of the Global South where the data are spatial. They are stored with their build scripts in the repository folder </w:t>
       </w:r>
-      <w:hyperlink r:id="rId3" w:history="1">
+      <w:hyperlink r:id="rId4" w:history="1">
         <w:r>
           <w:rPr>
             <w:rStyle w:val="Hyperlink"/>
@@ -8382,7 +8462,7 @@
           <w:p>
             <w:pPr/>
             <w:r>
-              <w:t xml:space="preserve">Total availability (runoff + recharge), groundwater recharge, renewable availability (Damerau formula)</w:t>
+              <w:t xml:space="preserve">Total availability (runoff + recharge), groundwater recharge, sustainable availability after environmental flows (Pastor et al. 2014), with Damerau's formula kept for comparison</w:t>
             </w:r>
           </w:p>
         </w:tc>
@@ -8795,41 +8875,6 @@
             <w:pPr/>
             <w:r>
               <w:t xml:space="preserve">Default "mixed", or a user choice</w:t>
-            </w:r>
-          </w:p>
-        </w:tc>
-      </w:tr>
-      <w:tr>
-        <w:tc>
-          <w:tcPr>
-            <w:tcW w:w="3120" w:type="dxa"/>
-          </w:tcPr>
-          <w:p>
-            <w:pPr/>
-            <w:r>
-              <w:t xml:space="preserve">Renewable-water factor (0.45 as in Damerau 2024, or 0.55)</w:t>
-            </w:r>
-          </w:p>
-        </w:tc>
-        <w:tc>
-          <w:tcPr>
-            <w:tcW w:w="3120" w:type="dxa"/>
-          </w:tcPr>
-          <w:p>
-            <w:pPr/>
-            <w:r>
-              <w:t xml:space="preserve">In Rosa et al. (2018) the fractions appear to be environmental flow reserves</w:t>
-            </w:r>
-          </w:p>
-        </w:tc>
-        <w:tc>
-          <w:tcPr>
-            <w:tcW w:w="3120" w:type="dxa"/>
-          </w:tcPr>
-          <w:p>
-            <w:pPr/>
-            <w:r>
-              <w:t xml:space="preserve">Check Rosa et al. (2018), Table S1</w:t>
             </w:r>
           </w:p>
         </w:tc>

</xml_diff>

<commit_message>
Update methodology defaults, limitations and open questions; R: FAO-56 season length and mass fallback for missing main-product ME
Co-Authored-By: Claude Opus 5.5 <noreply@anthropic.com>
Claude-Session: https://claude.ai/code/session_01GDeG8uxAFfNYAs7y3YT8qE
</commit_message>
<xml_diff>
--- a/Green_water_footprint_i-CLEANED_revised_methodology.docx
+++ b/Green_water_footprint_i-CLEANED_revised_methodology.docx
@@ -13,7 +13,7 @@
     <w:p>
       <w:pPr/>
       <w:r>
-        <w:t xml:space="preserve">Oct 7, 2026</w:t>
+        <w:t xml:space="preserve">Oct 8, 2026</w:t>
       </w:r>
       <w:r>
         <w:t xml:space="preserve"> · </w:t>
@@ -1359,7 +1359,7 @@
               <w:t xml:space="preserve">Region</w:t>
             </w:r>
             <w:r>
-              <w:t xml:space="preserve"> (admin level 1 or agro-ecological zone)</w:t>
+              <w:t xml:space="preserve"> (GADM 4.1 admin level 1; 2,620 regions in 166 Global South countries)</w:t>
             </w:r>
           </w:p>
         </w:tc>
@@ -1455,7 +1455,7 @@
           <w:p>
             <w:pPr/>
             <w:r>
-              <w:t xml:space="preserve">Only if Tier 2 is used</w:t>
+              <w:t xml:space="preserve">Optional; without it, the rainfall onset month and the FAO-56 season length are used (Section 3.3)</w:t>
             </w:r>
           </w:p>
         </w:tc>
@@ -1549,7 +1549,7 @@
         </w:numPr>
       </w:pPr>
       <w:r>
-        <w:t xml:space="preserve">Default crop-water tier: local FAO-56 (this draft) or Mialyk Tier 1 (Damerau 2024). Mialyk as default removes the need for planting dates.</w:t>
+        <w:t xml:space="preserve">Default crop-water tier: proposed hybrid (Section 3.4). Mialyk Tier 1 for the 59 crops it covers, local FAO-56 for forages and pastures and for any crop the user gives a calendar for. Team confirmation pending.</w:t>
       </w:r>
     </w:p>
     <w:p>
@@ -1561,7 +1561,7 @@
         </w:numPr>
       </w:pPr>
       <w:r>
-        <w:t xml:space="preserve">Whether capillary rise counts as blue water (Section 10.1).</w:t>
+        <w:t xml:space="preserve">Whether capillary rise counts as blue water (Section 10.1); this draft reports it as a separate line.</w:t>
       </w:r>
     </w:p>
     <w:p>
@@ -1671,7 +1671,7 @@
         <w:t xml:space="preserve">Spatial unit:</w:t>
       </w:r>
       <w:r>
-        <w:t xml:space="preserve"> one farm or enterprise, one site climate.</w:t>
+        <w:t xml:space="preserve"> one farm or enterprise in one GADM 4.1 admin-1 region. That region's hosted climate, crop water use and water availability apply unless the user enters site data.</w:t>
       </w:r>
     </w:p>
     <w:p>
@@ -1927,7 +1927,7 @@
           <w:p>
             <w:pPr/>
             <w:r>
-              <w:t xml:space="preserve">New input (site), or climate dataset</w:t>
+              <w:t xml:space="preserve">Hosted per admin-1 region (Annex A); site data override</w:t>
             </w:r>
           </w:p>
         </w:tc>
@@ -1973,7 +1973,7 @@
           <w:p>
             <w:pPr/>
             <w:r>
-              <w:t xml:space="preserve">New input (site); currently annual only (</w:t>
+              <w:t xml:space="preserve">Hosted per admin-1 region (Annex A); the code currently holds an annual total only (</w:t>
             </w:r>
             <w:r>
               <w:rPr>
@@ -2147,7 +2147,7 @@
           <w:p>
             <w:pPr/>
             <w:r>
-              <w:t xml:space="preserve">New lookup (FAO-56 Table 11) or default fractions</w:t>
+              <w:t xml:space="preserve">Hosted (FAO-56 Table 11) or default fractions</w:t>
             </w:r>
           </w:p>
         </w:tc>
@@ -2477,7 +2477,7 @@
           <w:p>
             <w:pPr/>
             <w:r>
-              <w:t xml:space="preserve">Existing (me_content); small lookup for main products that are not listed feeds</w:t>
+              <w:t xml:space="preserve">Existing (me_content); hosted table main_product_me.csv for main products that are not listed feeds (Annex A)</w:t>
             </w:r>
           </w:p>
         </w:tc>
@@ -2934,10 +2934,28 @@
         <w:rPr>
           <w:b/>
         </w:rPr>
+        <w:t xml:space="preserve">Annual crop calendar (default).</w:t>
+      </w:r>
+      <w:r>
+        <w:t xml:space="preserve"> When the user gives no planting month, the season starts in the rainfall onset month: the first month with P ≥ 0.5 ET0 that follows a month below that threshold (the FAO length-of-growing-period criterion). Its length is the FAO-56 Table 11 total for the crop, or 120 days if none is listed, with the default stage fractions. Both defaults are flagged.</w:t>
+      </w:r>
+    </w:p>
+    <w:p>
+      <w:pPr>
+        <w:pStyle w:val="ListParagraph"/>
+        <w:numPr>
+          <w:ilvl w:val="0"/>
+          <w:numId w:val="5"/>
+        </w:numPr>
+      </w:pPr>
+      <w:r>
+        <w:rPr>
+          <w:b/>
+        </w:rPr>
         <w:t xml:space="preserve">Perennial forage and pasture:</w:t>
       </w:r>
       <w:r>
-        <w:t xml:space="preserve"> the growing period covers every month in which the sward is active. Dormant months use the FAO-56 off-season coefficient, or zero if the sward is senescent. For grazed pasture, FAO-56 Table 12 coefficients (extensive or rotated grazing) are the defaults. Those already in the example datasets (0.30 / 0.75 / 0.75) match the extensive-grazing entry.</w:t>
+        <w:t xml:space="preserve"> the growing period covers the whole year. By default a month is active when P ≥ 0.5 ET0 and uses Kc,mid; other months use Kc,ini, which represents dry-season cover. A site-specific dormancy calendar (Kc = 0 when the sward is senescent) overrides this. For grazed pasture, FAO-56 Table 12 coefficients (extensive or rotated grazing) are the defaults. Those already in the example datasets (0.30 / 0.75 / 0.75) match the extensive-grazing entry.</w:t>
       </w:r>
     </w:p>
     <w:p>
@@ -2952,6 +2970,24 @@
         <w:rPr>
           <w:b/>
         </w:rPr>
+        <w:t xml:space="preserve">Fodder trees and shrubs</w:t>
+      </w:r>
+      <w:r>
+        <w:t xml:space="preserve"> (e.g. Leucaena, Gliricidia, Calliandra, mulberry) and cactus have no FAO-56 coefficient. Until expert values are agreed, they use the perennial rule with the Kc already stored in the i-CLEANED crop table, flagged unverified. Those values are undocumented and differ between databases (e.g. Leucaena 1.05 / 1.1–1.2 / 0.75–1.1); the cactus entry (Kc,mid 1.15) is implausible for a CAM plant and needs priority review.</w:t>
+      </w:r>
+    </w:p>
+    <w:p>
+      <w:pPr>
+        <w:pStyle w:val="ListParagraph"/>
+        <w:numPr>
+          <w:ilvl w:val="0"/>
+          <w:numId w:val="5"/>
+        </w:numPr>
+      </w:pPr>
+      <w:r>
+        <w:rPr>
+          <w:b/>
+        </w:rPr>
         <w:t xml:space="preserve">Several crops a year</w:t>
       </w:r>
       <w:r>
@@ -2973,7 +3009,7 @@
         <w:t xml:space="preserve">Climate inputs</w:t>
       </w:r>
       <w:r>
-        <w:t xml:space="preserve"> are long-term monthly means: at least 10 years, ideally a 30-year normal. A single year's weather makes scenarios incomparable.</w:t>
+        <w:t xml:space="preserve"> are long-term monthly means: at least 10 years, ideally a 30-year normal. A single year's weather makes scenarios incomparable. The hosted default is the WorldClim 2.1 1970–2000 normal for the farm's admin-1 region (Annex A).</w:t>
       </w:r>
     </w:p>
     <w:p>
@@ -3051,7 +3087,7 @@
           <w:p>
             <w:pPr/>
             <w:r>
-              <w:t xml:space="preserve">Used for</w:t>
+              <w:t xml:space="preserve">Used for (default)</w:t>
             </w:r>
           </w:p>
         </w:tc>
@@ -3122,40 +3158,40 @@
           <w:p>
             <w:pPr/>
             <w:r>
-              <w:t xml:space="preserve">2 (default)</w:t>
-            </w:r>
-          </w:p>
-        </w:tc>
-        <w:tc>
-          <w:tcPr>
-            <w:tcW w:w="2340" w:type="dxa"/>
-          </w:tcPr>
-          <w:p>
-            <w:pPr/>
-            <w:r>
-              <w:t xml:space="preserve">Eqs. 1–5 with site climate and the farm's crop calendar</w:t>
-            </w:r>
-          </w:p>
-        </w:tc>
-        <w:tc>
-          <w:tcPr>
-            <w:tcW w:w="2340" w:type="dxa"/>
-          </w:tcPr>
-          <w:p>
-            <w:pPr/>
-            <w:r>
-              <w:t xml:space="preserve">All feed grown on the farm or on land the herd uses</w:t>
-            </w:r>
-          </w:p>
-        </w:tc>
-        <w:tc>
-          <w:tcPr>
-            <w:tcW w:w="2340" w:type="dxa"/>
-          </w:tcPr>
-          <w:p>
-            <w:pPr/>
-            <w:r>
-              <w:t xml:space="preserve">Only tier that responds to local climate, calendar and scenario changes</w:t>
+              <w:t xml:space="preserve">2</w:t>
+            </w:r>
+          </w:p>
+        </w:tc>
+        <w:tc>
+          <w:tcPr>
+            <w:tcW w:w="2340" w:type="dxa"/>
+          </w:tcPr>
+          <w:p>
+            <w:pPr/>
+            <w:r>
+              <w:t xml:space="preserve">Eqs. 1–5 with the region's hosted climate (or site data) and the crop calendar</w:t>
+            </w:r>
+          </w:p>
+        </w:tc>
+        <w:tc>
+          <w:tcPr>
+            <w:tcW w:w="2340" w:type="dxa"/>
+          </w:tcPr>
+          <w:p>
+            <w:pPr/>
+            <w:r>
+              <w:t xml:space="preserve">Forages, pastures and fodder trees (72 i-CLEANED items without Mialyk data); any crop for which the user enters a planting month, e.g. to test a calendar or irrigation scenario</w:t>
+            </w:r>
+          </w:p>
+        </w:tc>
+        <w:tc>
+          <w:tcPr>
+            <w:tcW w:w="2340" w:type="dxa"/>
+          </w:tcPr>
+          <w:p>
+            <w:pPr/>
+            <w:r>
+              <w:t xml:space="preserve">Responds to local climate, calendar and scenario changes</w:t>
             </w:r>
           </w:p>
         </w:tc>
@@ -3179,29 +3215,29 @@
           <w:p>
             <w:pPr/>
             <w:r>
-              <w:t xml:space="preserve">Gridded green crop water use per hectare (Mialyk et al. 2024) for the supplier's region</w:t>
-            </w:r>
-          </w:p>
-        </w:tc>
-        <w:tc>
-          <w:tcPr>
-            <w:tcW w:w="2340" w:type="dxa"/>
-          </w:tcPr>
-          <w:p>
-            <w:pPr/>
-            <w:r>
-              <w:t xml:space="preserve">Purchased feed; items without a crop calendar</w:t>
-            </w:r>
-          </w:p>
-        </w:tc>
-        <w:tc>
-          <w:tcPr>
-            <w:tcW w:w="2340" w:type="dxa"/>
-          </w:tcPr>
-          <w:p>
-            <w:pPr/>
-            <w:r>
-              <w:t xml:space="preserve">Annual values; time-averaged, so they do not respond to on-farm interventions</w:t>
+              <w:t xml:space="preserve">Gridded green crop water use per hectare (Mialyk et al. 2024, 2010–2019) for the farm's or supplier's admin-1 region</w:t>
+            </w:r>
+          </w:p>
+        </w:tc>
+        <w:tc>
+          <w:tcPr>
+            <w:tcW w:w="2340" w:type="dxa"/>
+          </w:tcPr>
+          <w:p>
+            <w:pPr/>
+            <w:r>
+              <w:t xml:space="preserve">The 59 i-CLEANED crops mapped to a Mialyk crop (40 direct, 19 proxy), on-farm or purchased</w:t>
+            </w:r>
+          </w:p>
+        </w:tc>
+        <w:tc>
+          <w:tcPr>
+            <w:tcW w:w="2340" w:type="dxa"/>
+          </w:tcPr>
+          <w:p>
+            <w:pPr/>
+            <w:r>
+              <w:t xml:space="preserve">No planting date needed; time-averaged, so it does not respond to on-farm management changes</w:t>
             </w:r>
           </w:p>
         </w:tc>
@@ -3911,7 +3947,7 @@
         <w:t xml:space="preserve">me_content</w:t>
       </w:r>
       <w:r>
-        <w:t xml:space="preserve"> of the residue item and of the main product as listed in the i-CLEANED feed table. Where the main product is not itself a listed feed (e.g. groundnut kernels, cotton seed, cocoyam), take its ME from the hosted table main_product_me.csv (Feedipedia, ME for ruminants; Annex A). For example: maize grain 13.6, paddy rice 10.1, groundnut pods 18.2, cassava roots 12.4 MJ/kg DM. Local analyses override defaults.</w:t>
+        <w:t xml:space="preserve"> of the residue item and of the main product as listed in the i-CLEANED feed table. Where the main product is not itself a listed feed (e.g. groundnut kernels, cotton seed, cocoyam), take its ME from the hosted table main_product_me.csv (Feedipedia, ME for ruminants; Annex A). For example: maize grain 13.6, paddy rice 10.1, groundnut pods 18.2, cassava roots 12.4 MJ/kg DM. Local analyses override defaults. Where no ME exists for the main product (tomato fruits and whole sesame seeds today), mass allocation is used and flagged until a value is supplied.</w:t>
       </w:r>
     </w:p>
     <w:p>
@@ -3947,7 +3983,7 @@
         <w:t xml:space="preserve">Closure.</w:t>
       </w:r>
       <w:r>
-        <w:t xml:space="preserve"> For each crop, AF_M + AF_R = 1 exactly. Grain and residue entered as separate feed items must reference the same crop record, so their factors are computed together. A residue item whose crop has no main yield or no main removal is invalid. The tool must ask for the values rather than silently assigning AF_R = 1, which is what it does today.</w:t>
+        <w:t xml:space="preserve"> For each crop, AF_M + AF_R = 1 exactly. Grain and residue entered as separate feed items must reference the same crop record, so their factors are computed together. A residue item whose crop has no main yield or no main removal is invalid. The tool must ask for the values rather than silently assigning AF_R = 1, which is what it does today. If the user leaves them empty, the main-product yield defaults to the crop's dry_yield in the i-CLEANED crop table and the main removal to 1, both flagged.</w:t>
       </w:r>
     </w:p>
     <w:p>
@@ -5878,7 +5914,7 @@
         <w:t xml:space="preserve">Validation before publication.</w:t>
       </w:r>
       <w:r>
-        <w:t xml:space="preserve"> Hand-calculate one case study end to end and compare it with the code output. Then compare the results against published ranges for comparable systems (Mekonnen and Hoekstra 2012), and explain any deviation larger than a factor of two.</w:t>
+        <w:t xml:space="preserve"> Hand-calculate one case study end to end and compare it with the code output. This is done for Study_1 (Rungwe, Mbeya region, Tanzania) with the reference implementation (Section 9): 0.82 m³ green per kg FPCM, 4.92 m³ green per kg live weight, milk/meat split 0.60/0.40. A second case with irrigated fodder is still required. Then compare the results against published ranges for comparable systems (Mekonnen and Hoekstra 2012), and explain any deviation larger than a factor of two.</w:t>
       </w:r>
     </w:p>
     <w:p>
@@ -6610,7 +6646,7 @@
     <w:p>
       <w:pPr/>
       <w:r>
-        <w:t xml:space="preserve">Additional inputs needed:</w:t>
+        <w:t xml:space="preserve">Additional inputs needed, and where they now come from:</w:t>
       </w:r>
     </w:p>
     <w:p>
@@ -6622,7 +6658,7 @@
         </w:numPr>
       </w:pPr>
       <w:r>
-        <w:t xml:space="preserve">monthly ET0 and P for the site (a climate API can fill them, as the workshop proposed);</w:t>
+        <w:t xml:space="preserve">monthly ET0 and P: hosted per admin-1 region (Annex A), replacing the climate API the workshop proposed; site data override;</w:t>
       </w:r>
     </w:p>
     <w:p>
@@ -6634,7 +6670,7 @@
         </w:numPr>
       </w:pPr>
       <w:r>
-        <w:t xml:space="preserve">a crop calendar (start month and length of the growing period), using the existing </w:t>
+        <w:t xml:space="preserve">crop calendar: optional user input in the existing </w:t>
       </w:r>
       <w:r>
         <w:rPr>
@@ -6643,7 +6679,7 @@
         <w:t xml:space="preserve">cultivation_period</w:t>
       </w:r>
       <w:r>
-        <w:t xml:space="preserve"> field;</w:t>
+        <w:t xml:space="preserve"> field, otherwise the defaults of Section 3.3;</w:t>
       </w:r>
     </w:p>
     <w:p>
@@ -6655,7 +6691,7 @@
         </w:numPr>
       </w:pPr>
       <w:r>
-        <w:t xml:space="preserve">stage lengths (lookup table);</w:t>
+        <w:t xml:space="preserve">stage lengths: hosted FAO-56 Table 11;</w:t>
       </w:r>
     </w:p>
     <w:p>
@@ -6667,7 +6703,19 @@
         </w:numPr>
       </w:pPr>
       <w:r>
-        <w:t xml:space="preserve">ME of main products that are not listed feeds (small lookup table, editable).</w:t>
+        <w:t xml:space="preserve">ME of main products that are not listed feeds: hosted main_product_me.csv (31 products, editable);</w:t>
+      </w:r>
+    </w:p>
+    <w:p>
+      <w:pPr>
+        <w:pStyle w:val="ListParagraph"/>
+        <w:numPr>
+          <w:ilvl w:val="0"/>
+          <w:numId w:val="12"/>
+        </w:numPr>
+      </w:pPr>
+      <w:r>
+        <w:t xml:space="preserve">region (admin-1 dropdown) and irrigated yes/no per crop: the two new user inputs.</w:t>
       </w:r>
     </w:p>
     <w:p>
@@ -7216,10 +7264,118 @@
         <w:rPr>
           <w:b/>
         </w:rPr>
-        <w:t xml:space="preserve">One site climate</w:t>
-      </w:r>
-      <w:r>
-        <w:t xml:space="preserve"> per enterprise. Communal grazing far from the homestead may sit in a different climate.</w:t>
+        <w:t xml:space="preserve">One climate per enterprise</w:t>
+      </w:r>
+      <w:r>
+        <w:t xml:space="preserve">, the admin-1 regional mean unless site data are entered. Large or mountainous regions hide local gradients, and communal grazing far from the homestead may sit in a different climate.</w:t>
+      </w:r>
+    </w:p>
+    <w:p>
+      <w:pPr>
+        <w:pStyle w:val="ListParagraph"/>
+        <w:numPr>
+          <w:ilvl w:val="0"/>
+          <w:numId w:val="16"/>
+        </w:numPr>
+      </w:pPr>
+      <w:r>
+        <w:rPr>
+          <w:b/>
+        </w:rPr>
+        <w:t xml:space="preserve">Climate normals are 1970–2000</w:t>
+      </w:r>
+      <w:r>
+        <w:t xml:space="preserve"> (WorldClim 2.1), older than the Mialyk (2010–2019) and WaterGAP (1990–2019) periods. Tier 1 and Tier 2 values therefore rest on different climate periods. A switch to TerraClimate or CHIRPS normals is prepared in the build scripts.</w:t>
+      </w:r>
+    </w:p>
+    <w:p>
+      <w:pPr>
+        <w:pStyle w:val="ListParagraph"/>
+        <w:numPr>
+          <w:ilvl w:val="0"/>
+          <w:numId w:val="16"/>
+        </w:numPr>
+      </w:pPr>
+      <w:r>
+        <w:rPr>
+          <w:b/>
+        </w:rPr>
+        <w:t xml:space="preserve">Tier 1 green/blue split is approximate.</w:t>
+      </w:r>
+      <w:r>
+        <w:t xml:space="preserve"> The public Mialyk file gives total water use per system; green irrigated = min(rainfed, irrigated) and blue = the difference (Mekonnen and Hoekstra 2011). Rainfed green includes capillary rise (below 1% nationally for most crops). An exact split needs Mialyk dataset 2.8.</w:t>
+      </w:r>
+    </w:p>
+    <w:p>
+      <w:pPr>
+        <w:pStyle w:val="ListParagraph"/>
+        <w:numPr>
+          <w:ilvl w:val="0"/>
+          <w:numId w:val="16"/>
+        </w:numPr>
+      </w:pPr>
+      <w:r>
+        <w:rPr>
+          <w:b/>
+        </w:rPr>
+        <w:t xml:space="preserve">Tier 1 data provenance.</w:t>
+      </w:r>
+      <w:r>
+        <w:t xml:space="preserve"> The Mialyk files were taken from Internet Archive copies while 4TU was offline (identical file size) and must be re-checked against 4TU before publication.</w:t>
+      </w:r>
+    </w:p>
+    <w:p>
+      <w:pPr>
+        <w:pStyle w:val="ListParagraph"/>
+        <w:numPr>
+          <w:ilvl w:val="0"/>
+          <w:numId w:val="16"/>
+        </w:numPr>
+      </w:pPr>
+      <w:r>
+        <w:rPr>
+          <w:b/>
+        </w:rPr>
+        <w:t xml:space="preserve">Environmental flows on local runoff.</w:t>
+      </w:r>
+      <w:r>
+        <w:t xml:space="preserve"> The Variable Monthly Flow method was designed for river discharge; applying it to runoff plus recharge per grid cell is an approximation (Section 10.6).</w:t>
+      </w:r>
+    </w:p>
+    <w:p>
+      <w:pPr>
+        <w:pStyle w:val="ListParagraph"/>
+        <w:numPr>
+          <w:ilvl w:val="0"/>
+          <w:numId w:val="16"/>
+        </w:numPr>
+      </w:pPr>
+      <w:r>
+        <w:rPr>
+          <w:b/>
+        </w:rPr>
+        <w:t xml:space="preserve">Purchased feed</w:t>
+      </w:r>
+      <w:r>
+        <w:t xml:space="preserve"> without supplier data is outside the boundary; the excluded share of dry-matter intake is reported (9.7% in Study_1).</w:t>
+      </w:r>
+    </w:p>
+    <w:p>
+      <w:pPr>
+        <w:pStyle w:val="ListParagraph"/>
+        <w:numPr>
+          <w:ilvl w:val="0"/>
+          <w:numId w:val="16"/>
+        </w:numPr>
+      </w:pPr>
+      <w:r>
+        <w:rPr>
+          <w:b/>
+        </w:rPr>
+        <w:t xml:space="preserve">Limited validation.</w:t>
+      </w:r>
+      <w:r>
+        <w:t xml:space="preserve"> The method has been run end to end on one farm (Study_1, rainfed). Results for irrigated and arid systems are untested.</w:t>
       </w:r>
     </w:p>
     <w:p>
@@ -7245,7 +7401,7 @@
         <w:t xml:space="preserve">Utilization defaults:</w:t>
       </w:r>
       <w:r>
-        <w:t xml:space="preserve"> can field data from CGIAR sites replace the proposed 0.35 / 0.60 / 0.85?</w:t>
+        <w:t xml:space="preserve"> can field data from CGIAR sites replace the proposed 0.35 / 0.60 / 0.85? This is the most sensitive default: in Study_1, 0.35 instead of 0.9 raises pasture green water per kg about 2.6 times.</w:t>
       </w:r>
     </w:p>
     <w:p>
@@ -7263,7 +7419,7 @@
         <w:t xml:space="preserve">Main-product ME values:</w:t>
       </w:r>
       <w:r>
-        <w:t xml:space="preserve"> confirm the ME defaults for main products that are not listed feeds.</w:t>
+        <w:t xml:space="preserve"> 29 of 31 are taken from Feedipedia; values are needed for tomato fruits and whole sesame seeds (mass allocation until then).</w:t>
       </w:r>
     </w:p>
     <w:p>
@@ -7278,6 +7434,78 @@
         <w:rPr>
           <w:b/>
         </w:rPr>
+        <w:t xml:space="preserve">Kc for fodder trees, shrubs and cactus:</w:t>
+      </w:r>
+      <w:r>
+        <w:t xml:space="preserve"> expert values to replace the undocumented i-CLEANED entries (Section 3.3).</w:t>
+      </w:r>
+    </w:p>
+    <w:p>
+      <w:pPr>
+        <w:pStyle w:val="ListParagraph"/>
+        <w:numPr>
+          <w:ilvl w:val="0"/>
+          <w:numId w:val="17"/>
+        </w:numPr>
+      </w:pPr>
+      <w:r>
+        <w:rPr>
+          <w:b/>
+        </w:rPr>
+        <w:t xml:space="preserve">Default crop-water tier:</w:t>
+      </w:r>
+      <w:r>
+        <w:t xml:space="preserve"> confirm the hybrid of Section 3.4 (Mialyk for mapped crops, FAO-56 for forages).</w:t>
+      </w:r>
+    </w:p>
+    <w:p>
+      <w:pPr>
+        <w:pStyle w:val="ListParagraph"/>
+        <w:numPr>
+          <w:ilvl w:val="0"/>
+          <w:numId w:val="17"/>
+        </w:numPr>
+      </w:pPr>
+      <w:r>
+        <w:rPr>
+          <w:b/>
+        </w:rPr>
+        <w:t xml:space="preserve">Production system per livestock type</w:t>
+      </w:r>
+      <w:r>
+        <w:t xml:space="preserve"> (grazing, mixed or industrial) for drinking and service water: default "mixed", or a user choice?</w:t>
+      </w:r>
+    </w:p>
+    <w:p>
+      <w:pPr>
+        <w:pStyle w:val="ListParagraph"/>
+        <w:numPr>
+          <w:ilvl w:val="0"/>
+          <w:numId w:val="17"/>
+        </w:numPr>
+      </w:pPr>
+      <w:r>
+        <w:rPr>
+          <w:b/>
+        </w:rPr>
+        <w:t xml:space="preserve">Capillary rise:</w:t>
+      </w:r>
+      <w:r>
+        <w:t xml:space="preserve"> report as a separate blue line (this draft) or include in blue water as Mialyk et al. (2024) do?</w:t>
+      </w:r>
+    </w:p>
+    <w:p>
+      <w:pPr>
+        <w:pStyle w:val="ListParagraph"/>
+        <w:numPr>
+          <w:ilvl w:val="0"/>
+          <w:numId w:val="17"/>
+        </w:numPr>
+      </w:pPr>
+      <w:r>
+        <w:rPr>
+          <w:b/>
+        </w:rPr>
         <w:t xml:space="preserve">Purchased feed:</w:t>
       </w:r>
       <w:r>
@@ -7296,10 +7524,10 @@
         <w:rPr>
           <w:b/>
         </w:rPr>
-        <w:t xml:space="preserve">Climate API:</w:t>
-      </w:r>
-      <w:r>
-        <w:t xml:space="preserve"> which product supplies monthly ET0 and P? Candidates are CHIRPS for rainfall and TerraClimate or FAO WaPOR for ET0; this needs a decision.</w:t>
+        <w:t xml:space="preserve">Climate normals:</w:t>
+      </w:r>
+      <w:r>
+        <w:t xml:space="preserve"> keep WorldClim 2.1 (1970–2000) or move to TerraClimate or CHIRPS (1991–2020)?</w:t>
       </w:r>
     </w:p>
     <w:p>
@@ -7314,10 +7542,10 @@
         <w:rPr>
           <w:b/>
         </w:rPr>
-        <w:t xml:space="preserve">Test cases:</w:t>
-      </w:r>
-      <w:r>
-        <w:t xml:space="preserve"> which two case studies (one with irrigated fodder) will be used for validation before any published result?</w:t>
+        <w:t xml:space="preserve">Second test case:</w:t>
+      </w:r>
+      <w:r>
+        <w:t xml:space="preserve"> which case study with irrigated fodder will be used for validation before any published result?</w:t>
       </w:r>
     </w:p>
     <w:p>
@@ -8734,7 +8962,7 @@
           <w:p>
             <w:pPr/>
             <w:r>
-              <w:t xml:space="preserve">Suggestion</w:t>
+              <w:t xml:space="preserve">Default used until then</w:t>
             </w:r>
           </w:p>
         </w:tc>
@@ -8769,7 +8997,7 @@
           <w:p>
             <w:pPr/>
             <w:r>
-              <w:t xml:space="preserve">Expert values or literature review</w:t>
+              <w:t xml:space="preserve">i-CLEANED crop-table Kc, flagged unverified (Section 3.3)</w:t>
             </w:r>
           </w:p>
         </w:tc>
@@ -8804,7 +9032,7 @@
           <w:p>
             <w:pPr/>
             <w:r>
-              <w:t xml:space="preserve">Expert value or local analysis</w:t>
+              <w:t xml:space="preserve">Mass allocation, flagged (Section 5.3)</w:t>
             </w:r>
           </w:p>
         </w:tc>
@@ -8839,7 +9067,7 @@
           <w:p>
             <w:pPr/>
             <w:r>
-              <w:t xml:space="preserve">Expert confirmation or field data</w:t>
+              <w:t xml:space="preserve">0.35 / 0.60 / 0.85, flagged assumed (Section 4.1)</w:t>
             </w:r>
           </w:p>
         </w:tc>
@@ -8874,7 +9102,42 @@
           <w:p>
             <w:pPr/>
             <w:r>
-              <w:t xml:space="preserve">Default "mixed", or a user choice</w:t>
+              <w:t xml:space="preserve">"Mixed", or a user choice</w:t>
+            </w:r>
+          </w:p>
+        </w:tc>
+      </w:tr>
+      <w:tr>
+        <w:tc>
+          <w:tcPr>
+            <w:tcW w:w="3120" w:type="dxa"/>
+          </w:tcPr>
+          <w:p>
+            <w:pPr/>
+            <w:r>
+              <w:t xml:space="preserve">Capillary rise</w:t>
+            </w:r>
+          </w:p>
+        </w:tc>
+        <w:tc>
+          <w:tcPr>
+            <w:tcW w:w="3120" w:type="dxa"/>
+          </w:tcPr>
+          <w:p>
+            <w:pPr/>
+            <w:r>
+              <w:t xml:space="preserve">Blue or separate line</w:t>
+            </w:r>
+          </w:p>
+        </w:tc>
+        <w:tc>
+          <w:tcPr>
+            <w:tcW w:w="3120" w:type="dxa"/>
+          </w:tcPr>
+          <w:p>
+            <w:pPr/>
+            <w:r>
+              <w:t xml:space="preserve">Separate line (Section 10.1)</w:t>
             </w:r>
           </w:p>
         </w:tc>
@@ -8909,7 +9172,77 @@
           <w:p>
             <w:pPr/>
             <w:r>
-              <w:t xml:space="preserve">Expert review</w:t>
+              <w:t xml:space="preserve">Current mappings, flagged assumed</w:t>
+            </w:r>
+          </w:p>
+        </w:tc>
+      </w:tr>
+      <w:tr>
+        <w:tc>
+          <w:tcPr>
+            <w:tcW w:w="3120" w:type="dxa"/>
+          </w:tcPr>
+          <w:p>
+            <w:pPr/>
+            <w:r>
+              <w:t xml:space="preserve">Re-download of Mialyk files from 4TU</w:t>
+            </w:r>
+          </w:p>
+        </w:tc>
+        <w:tc>
+          <w:tcPr>
+            <w:tcW w:w="3120" w:type="dxa"/>
+          </w:tcPr>
+          <w:p>
+            <w:pPr/>
+            <w:r>
+              <w:t xml:space="preserve">Internet Archive copies used during the build</w:t>
+            </w:r>
+          </w:p>
+        </w:tc>
+        <w:tc>
+          <w:tcPr>
+            <w:tcW w:w="3120" w:type="dxa"/>
+          </w:tcPr>
+          <w:p>
+            <w:pPr/>
+            <w:r>
+              <w:t xml:space="preserve">Archive copies (identical size)</w:t>
+            </w:r>
+          </w:p>
+        </w:tc>
+      </w:tr>
+      <w:tr>
+        <w:tc>
+          <w:tcPr>
+            <w:tcW w:w="3120" w:type="dxa"/>
+          </w:tcPr>
+          <w:p>
+            <w:pPr/>
+            <w:r>
+              <w:t xml:space="preserve">Second validation case with irrigated fodder</w:t>
+            </w:r>
+          </w:p>
+        </w:tc>
+        <w:tc>
+          <w:tcPr>
+            <w:tcW w:w="3120" w:type="dxa"/>
+          </w:tcPr>
+          <w:p>
+            <w:pPr/>
+            <w:r>
+              <w:t xml:space="preserve">Only Study_1 (rainfed) is tested</w:t>
+            </w:r>
+          </w:p>
+        </w:tc>
+        <w:tc>
+          <w:tcPr>
+            <w:tcW w:w="3120" w:type="dxa"/>
+          </w:tcPr>
+          <w:p>
+            <w:pPr/>
+            <w:r>
+              <w:t xml:space="preserve">–</w:t>
             </w:r>
           </w:p>
         </w:tc>

</xml_diff>

<commit_message>
Align water footprint units with other i-CLEANED indicators (FAO FPCM, carcass weight, protein); no per-kg-wool footprint; propose allocation for all indicators
Co-Authored-By: Claude Opus 5.5 <noreply@anthropic.com>
Claude-Session: https://claude.ai/code/session_01GDeG8uxAFfNYAs7y3YT8qE
</commit_message>
<xml_diff>
--- a/Green_water_footprint_i-CLEANED_revised_methodology.docx
+++ b/Green_water_footprint_i-CLEANED_revised_methodology.docx
@@ -385,7 +385,7 @@
               <w:jc w:val="left"/>
             </w:pPr>
             <w:r>
-              <w:t xml:space="preserve">Milk standardized to 4.0% fat and 3.3% true protein (IDF 2022), Eq. 22</w:t>
+              <w:t xml:space="preserve">FAO/GLEAM formula used by all i-CLEANED indicators (Eq. 22); the IDF (2022) FPCM is reported as a secondary figure (Eq. 22b)</w:t>
             </w:r>
           </w:p>
         </w:tc>
@@ -411,19 +411,19 @@
               <w:jc w:val="left"/>
             </w:pPr>
             <w:r>
-              <w:t xml:space="preserve">1 kg live weight output</w:t>
-            </w:r>
-          </w:p>
-        </w:tc>
-        <w:tc>
-          <w:tcPr/>
-          <w:p>
-            <w:pPr>
-              <w:pStyle w:val="Compact"/>
-              <w:jc w:val="left"/>
-            </w:pPr>
-            <w:r>
-              <w:t xml:space="preserve">Live weight of animals sold or slaughtered plus net herd growth over the year</w:t>
+              <w:t xml:space="preserve">1 kg meat (carcass weight)</w:t>
+            </w:r>
+          </w:p>
+        </w:tc>
+        <w:tc>
+          <w:tcPr/>
+          <w:p>
+            <w:pPr>
+              <w:pStyle w:val="Compact"/>
+              <w:jc w:val="left"/>
+            </w:pPr>
+            <w:r>
+              <w:t xml:space="preserve">Annual live-weight gain × carcass fraction, as for all i-CLEANED indicators; per kg live weight reported as a secondary figure</w:t>
             </w:r>
           </w:p>
         </w:tc>
@@ -437,31 +437,31 @@
               <w:jc w:val="left"/>
             </w:pPr>
             <w:r>
-              <w:t xml:space="preserve">Wool</w:t>
-            </w:r>
-          </w:p>
-        </w:tc>
-        <w:tc>
-          <w:tcPr/>
-          <w:p>
-            <w:pPr>
-              <w:pStyle w:val="Compact"/>
-              <w:jc w:val="left"/>
-            </w:pPr>
-            <w:r>
-              <w:t xml:space="preserve">1 kg greasy wool</w:t>
-            </w:r>
-          </w:p>
-        </w:tc>
-        <w:tc>
-          <w:tcPr/>
-          <w:p>
-            <w:pPr>
-              <w:pStyle w:val="Compact"/>
-              <w:jc w:val="left"/>
-            </w:pPr>
-            <w:r>
-              <w:t xml:space="preserve">Wool as shorn</w:t>
+              <w:t xml:space="preserve">Edible protein</w:t>
+            </w:r>
+          </w:p>
+        </w:tc>
+        <w:tc>
+          <w:tcPr/>
+          <w:p>
+            <w:pPr>
+              <w:pStyle w:val="Compact"/>
+              <w:jc w:val="left"/>
+            </w:pPr>
+            <w:r>
+              <w:t xml:space="preserve">1 kg protein in milk and meat</w:t>
+            </w:r>
+          </w:p>
+        </w:tc>
+        <w:tc>
+          <w:tcPr/>
+          <w:p>
+            <w:pPr>
+              <w:pStyle w:val="Compact"/>
+              <w:jc w:val="left"/>
+            </w:pPr>
+            <w:r>
+              <w:t xml:space="preserve">As computed by i-CLEANED for the other indicators</w:t>
             </w:r>
           </w:p>
         </w:tc>
@@ -475,31 +475,31 @@
               <w:jc w:val="left"/>
             </w:pPr>
             <w:r>
-              <w:t xml:space="preserve">Edible protein</w:t>
-            </w:r>
-          </w:p>
-        </w:tc>
-        <w:tc>
-          <w:tcPr/>
-          <w:p>
-            <w:pPr>
-              <w:pStyle w:val="Compact"/>
-              <w:jc w:val="left"/>
-            </w:pPr>
-            <w:r>
-              <w:t xml:space="preserve">1 kg protein in milk and meat</w:t>
-            </w:r>
-          </w:p>
-        </w:tc>
-        <w:tc>
-          <w:tcPr/>
-          <w:p>
-            <w:pPr>
-              <w:pStyle w:val="Compact"/>
-              <w:jc w:val="left"/>
-            </w:pPr>
-            <w:r>
-              <w:t xml:space="preserve">Used for comparison across products</w:t>
+              <w:t xml:space="preserve">Wool</w:t>
+            </w:r>
+          </w:p>
+        </w:tc>
+        <w:tc>
+          <w:tcPr/>
+          <w:p>
+            <w:pPr>
+              <w:pStyle w:val="Compact"/>
+              <w:jc w:val="left"/>
+            </w:pPr>
+            <w:r>
+              <w:t xml:space="preserve">–</w:t>
+            </w:r>
+          </w:p>
+        </w:tc>
+        <w:tc>
+          <w:tcPr/>
+          <w:p>
+            <w:pPr>
+              <w:pStyle w:val="Compact"/>
+              <w:jc w:val="left"/>
+            </w:pPr>
+            <w:r>
+              <w:t xml:space="preserve">Receives its share of water (Section 8) so that milk and meat are not charged for it, but no water footprint per kg wool is reported, because i-CLEANED does not report wool as an output</w:t>
             </w:r>
           </w:p>
         </w:tc>
@@ -537,12 +537,20 @@
               <w:jc w:val="left"/>
             </w:pPr>
             <w:r>
-              <w:t xml:space="preserve">Receives its share of water (Section 8) but no per-unit figure is reported</w:t>
+              <w:t xml:space="preserve">Receives its share of water (Section 8); no per-unit figure</w:t>
             </w:r>
           </w:p>
         </w:tc>
       </w:tr>
     </w:tbl>
+    <w:p>
+      <w:pPr>
+        <w:pStyle w:val="BodyText"/>
+      </w:pPr>
+      <w:r>
+        <w:t xml:space="preserve">These are the same units in which i-CLEANED already reports greenhouse gas emissions, land requirement, nitrogen balance and soil erosion, so that water results can be read side by side with them.</w:t>
+      </w:r>
+    </w:p>
     <w:p>
       <w:pPr>
         <w:pStyle w:val="BodyText"/>
@@ -14244,7 +14252,7 @@
               <w:jc w:val="left"/>
             </w:pPr>
             <w:r>
-              <w:t xml:space="preserve">Eq. 22 below, from milk yield, fat % and true protein %</w:t>
+              <w:t xml:space="preserve">Eq. 22, from milk yield, fat % and protein % (same formula as the other i-CLEANED indicators)</w:t>
             </w:r>
           </w:p>
         </w:tc>
@@ -14270,7 +14278,7 @@
               <w:jc w:val="left"/>
             </w:pPr>
             <w:r>
-              <w:t xml:space="preserve">kg live weight/yr</w:t>
+              <w:t xml:space="preserve">kg carcass weight/yr</w:t>
             </w:r>
           </w:p>
         </w:tc>
@@ -14319,7 +14327,7 @@
               <w:t xml:space="preserve"> </w:t>
             </w:r>
             <w:r>
-              <w:t xml:space="preserve">× annual weight gain of class k (steady state); carcass weight reported as a derived figure</w:t>
+              <w:t xml:space="preserve">× annual weight gain of class k × carcass fraction of class k (steady state)</w:t>
             </w:r>
           </w:p>
         </w:tc>
@@ -14333,81 +14341,6 @@
               <w:jc w:val="left"/>
             </w:pPr>
             <w:r>
-              <w:t xml:space="preserve">Wool</w:t>
-            </w:r>
-          </w:p>
-        </w:tc>
-        <w:tc>
-          <w:tcPr/>
-          <w:p>
-            <w:pPr>
-              <w:pStyle w:val="Compact"/>
-              <w:jc w:val="left"/>
-            </w:pPr>
-            <w:r>
-              <w:t xml:space="preserve">kg greasy wool/yr</w:t>
-            </w:r>
-          </w:p>
-        </w:tc>
-        <w:tc>
-          <w:tcPr/>
-          <w:p>
-            <w:pPr>
-              <w:pStyle w:val="Compact"/>
-              <w:jc w:val="left"/>
-            </w:pPr>
-            <m:oMath>
-              <m:nary>
-                <m:naryPr>
-                  <m:chr m:val="∑"/>
-                  <m:limLoc m:val="undOvr"/>
-                  <m:subHide m:val="off"/>
-                  <m:supHide m:val="on"/>
-                </m:naryPr>
-                <m:sub>
-                  <m:r>
-                    <m:t>k</m:t>
-                  </m:r>
-                </m:sub>
-                <m:sup>
-                  <m:r>
-                    <m:t>​</m:t>
-                  </m:r>
-                </m:sup>
-                <m:e>
-                  <m:sSub>
-                    <m:e>
-                      <m:r>
-                        <m:t>N</m:t>
-                      </m:r>
-                    </m:e>
-                    <m:sub>
-                      <m:r>
-                        <m:t>k</m:t>
-                      </m:r>
-                    </m:sub>
-                  </m:sSub>
-                </m:e>
-              </m:nary>
-            </m:oMath>
-            <w:r>
-              <w:t xml:space="preserve"> </w:t>
-            </w:r>
-            <w:r>
-              <w:t xml:space="preserve">× annual wool of class k</w:t>
-            </w:r>
-          </w:p>
-        </w:tc>
-      </w:tr>
-      <w:tr>
-        <w:tc>
-          <w:tcPr/>
-          <w:p>
-            <w:pPr>
-              <w:pStyle w:val="Compact"/>
-              <w:jc w:val="left"/>
-            </w:pPr>
-            <w:r>
               <w:t xml:space="preserve">Edible protein</w:t>
             </w:r>
           </w:p>
@@ -14432,7 +14365,7 @@
               <w:jc w:val="left"/>
             </w:pPr>
             <w:r>
-              <w:t xml:space="preserve">Protein in milk plus protein in meat; its water is (</w:t>
+              <w:t xml:space="preserve">Milk FPCM × milk protein % plus carcass weight × meat protein %, as in i-CLEANED; its water is (</w:t>
             </w:r>
             <m:oMath>
               <m:r>
@@ -14566,7 +14499,113 @@
           </w:p>
         </w:tc>
       </w:tr>
+      <w:tr>
+        <w:tc>
+          <w:tcPr/>
+          <w:p>
+            <w:pPr>
+              <w:pStyle w:val="Compact"/>
+              <w:jc w:val="left"/>
+            </w:pPr>
+            <w:r>
+              <w:t xml:space="preserve">Wool, draught</w:t>
+            </w:r>
+          </w:p>
+        </w:tc>
+        <w:tc>
+          <w:tcPr/>
+          <w:p>
+            <w:pPr>
+              <w:pStyle w:val="Compact"/>
+              <w:jc w:val="left"/>
+            </w:pPr>
+            <w:r>
+              <w:t xml:space="preserve">–</w:t>
+            </w:r>
+          </w:p>
+        </w:tc>
+        <w:tc>
+          <w:tcPr/>
+          <w:p>
+            <w:pPr>
+              <w:pStyle w:val="Compact"/>
+              <w:jc w:val="left"/>
+            </w:pPr>
+            <w:r>
+              <w:t xml:space="preserve">No quantity reported; they only receive their share</w:t>
+            </w:r>
+            <w:r>
+              <w:t xml:space="preserve"> </w:t>
+            </w:r>
+            <m:oMath>
+              <m:r>
+                <m:t>A</m:t>
+              </m:r>
+              <m:sSub>
+                <m:e>
+                  <m:r>
+                    <m:t>F</m:t>
+                  </m:r>
+                </m:e>
+                <m:sub>
+                  <m:r>
+                    <m:t>j</m:t>
+                  </m:r>
+                </m:sub>
+              </m:sSub>
+            </m:oMath>
+          </w:p>
+        </w:tc>
+      </w:tr>
     </w:tbl>
+    <w:p>
+      <w:pPr>
+        <w:pStyle w:val="BodyText"/>
+      </w:pPr>
+      <w:r>
+        <w:t xml:space="preserve">Secondary figures, reported for comparison with dairy and beef studies: water per kg IDF FPCM (Eq. 22b) and per kg live weight (</w:t>
+      </w:r>
+      <m:oMath>
+        <m:nary>
+          <m:naryPr>
+            <m:chr m:val="∑"/>
+            <m:limLoc m:val="undOvr"/>
+            <m:subHide m:val="off"/>
+            <m:supHide m:val="on"/>
+          </m:naryPr>
+          <m:sub>
+            <m:r>
+              <m:t>k</m:t>
+            </m:r>
+          </m:sub>
+          <m:sup>
+            <m:r>
+              <m:t>​</m:t>
+            </m:r>
+          </m:sup>
+          <m:e>
+            <m:sSub>
+              <m:e>
+                <m:r>
+                  <m:t>N</m:t>
+                </m:r>
+              </m:e>
+              <m:sub>
+                <m:r>
+                  <m:t>k</m:t>
+                </m:r>
+              </m:sub>
+            </m:sSub>
+          </m:e>
+        </m:nary>
+      </m:oMath>
+      <w:r>
+        <w:t xml:space="preserve"> </w:t>
+      </w:r>
+      <w:r>
+        <w:t xml:space="preserve">× annual weight gain).</w:t>
+      </w:r>
+    </w:p>
     <w:p>
       <w:pPr>
         <w:pStyle w:val="BodyText"/>
@@ -14621,13 +14660,7 @@
             </m:dPr>
             <m:e>
               <m:r>
-                <m:t>0.1226</m:t>
-              </m:r>
-              <m:r>
-                <m:t> </m:t>
-              </m:r>
-              <m:r>
-                <m:t>F</m:t>
+                <m:t>0.337</m:t>
               </m:r>
               <m:r>
                 <m:rPr>
@@ -14636,44 +14669,14 @@
                 <m:t>+</m:t>
               </m:r>
               <m:r>
-                <m:t>0.0776</m:t>
+                <m:t>0.116</m:t>
               </m:r>
               <m:r>
                 <m:t> </m:t>
               </m:r>
-              <m:sSub>
-                <m:e>
-                  <m:r>
-                    <m:t>P</m:t>
-                  </m:r>
-                </m:e>
-                <m:sub>
-                  <m:r>
-                    <m:rPr>
-                      <m:sty m:val="p"/>
-                    </m:rPr>
-                    <m:t>t</m:t>
-                  </m:r>
-                  <m:r>
-                    <m:rPr>
-                      <m:sty m:val="p"/>
-                    </m:rPr>
-                    <m:t>r</m:t>
-                  </m:r>
-                  <m:r>
-                    <m:rPr>
-                      <m:sty m:val="p"/>
-                    </m:rPr>
-                    <m:t>u</m:t>
-                  </m:r>
-                  <m:r>
-                    <m:rPr>
-                      <m:sty m:val="p"/>
-                    </m:rPr>
-                    <m:t>e</m:t>
-                  </m:r>
-                </m:sub>
-              </m:sSub>
+              <m:r>
+                <m:t>F</m:t>
+              </m:r>
               <m:r>
                 <m:rPr>
                   <m:sty m:val="p"/>
@@ -14681,7 +14684,13 @@
                 <m:t>+</m:t>
               </m:r>
               <m:r>
-                <m:t>0.2534</m:t>
+                <m:t>0.06</m:t>
+              </m:r>
+              <m:r>
+                <m:t> </m:t>
+              </m:r>
+              <m:r>
+                <m:t>P</m:t>
               </m:r>
             </m:e>
           </m:d>
@@ -14693,7 +14702,7 @@
               <m:nor/>
               <m:sty m:val="p"/>
             </m:rPr>
-            <m:t>(Eq. 22; IDF 2022)</m:t>
+            <m:t>(Eq. 22; FAO 2016b)</m:t>
           </m:r>
         </m:oMath>
       </m:oMathPara>
@@ -14703,10 +14712,7 @@
         <w:pStyle w:val="FirstParagraph"/>
       </w:pPr>
       <w:r>
-        <w:t xml:space="preserve">with Milk in kg, F the fat content (%) and</w:t>
-      </w:r>
-      <w:r>
-        <w:t xml:space="preserve"> </w:t>
+        <w:t xml:space="preserve">with Milk in kg, F the fat content (%) and P the protein content (%). This is the formula i-CLEANED uses for all its per-kg-milk indicators. The IDF (2022) formula, reported as a secondary figure, is shown below; it needs true protein (</w:t>
       </w:r>
       <m:oMath>
         <m:sSub>
@@ -14744,11 +14750,154 @@
         </m:sSub>
       </m:oMath>
       <w:r>
-        <w:t xml:space="preserve"> </w:t>
-      </w:r>
-      <w:r>
-        <w:t xml:space="preserve">the true protein content (%). If only crude protein is recorded, it must be converted to true protein before use.</w:t>
-      </w:r>
+        <w:t xml:space="preserve">), so crude protein must be converted first:</w:t>
+      </w:r>
+    </w:p>
+    <w:p>
+      <w:pPr>
+        <w:pStyle w:val="BodyText"/>
+      </w:pPr>
+      <m:oMathPara>
+        <m:oMathParaPr>
+          <m:jc m:val="center"/>
+        </m:oMathParaPr>
+        <m:oMath>
+          <m:r>
+            <m:t>F</m:t>
+          </m:r>
+          <m:r>
+            <m:t>P</m:t>
+          </m:r>
+          <m:r>
+            <m:t>C</m:t>
+          </m:r>
+          <m:sSub>
+            <m:e>
+              <m:r>
+                <m:t>M</m:t>
+              </m:r>
+            </m:e>
+            <m:sub>
+              <m:r>
+                <m:t>I</m:t>
+              </m:r>
+              <m:r>
+                <m:t>D</m:t>
+              </m:r>
+              <m:r>
+                <m:t>F</m:t>
+              </m:r>
+            </m:sub>
+          </m:sSub>
+          <m:r>
+            <m:rPr>
+              <m:sty m:val="p"/>
+            </m:rPr>
+            <m:t>=</m:t>
+          </m:r>
+          <m:r>
+            <m:t>M</m:t>
+          </m:r>
+          <m:r>
+            <m:t>i</m:t>
+          </m:r>
+          <m:r>
+            <m:t>l</m:t>
+          </m:r>
+          <m:r>
+            <m:t>k</m:t>
+          </m:r>
+          <m:r>
+            <m:rPr>
+              <m:sty m:val="p"/>
+            </m:rPr>
+            <m:t>×</m:t>
+          </m:r>
+          <m:d>
+            <m:dPr>
+              <m:begChr m:val="("/>
+              <m:endChr m:val=")"/>
+              <m:sepChr m:val=""/>
+              <m:grow/>
+            </m:dPr>
+            <m:e>
+              <m:r>
+                <m:t>0.1226</m:t>
+              </m:r>
+              <m:r>
+                <m:t> </m:t>
+              </m:r>
+              <m:r>
+                <m:t>F</m:t>
+              </m:r>
+              <m:r>
+                <m:rPr>
+                  <m:sty m:val="p"/>
+                </m:rPr>
+                <m:t>+</m:t>
+              </m:r>
+              <m:r>
+                <m:t>0.0776</m:t>
+              </m:r>
+              <m:r>
+                <m:t> </m:t>
+              </m:r>
+              <m:sSub>
+                <m:e>
+                  <m:r>
+                    <m:t>P</m:t>
+                  </m:r>
+                </m:e>
+                <m:sub>
+                  <m:r>
+                    <m:rPr>
+                      <m:sty m:val="p"/>
+                    </m:rPr>
+                    <m:t>t</m:t>
+                  </m:r>
+                  <m:r>
+                    <m:rPr>
+                      <m:sty m:val="p"/>
+                    </m:rPr>
+                    <m:t>r</m:t>
+                  </m:r>
+                  <m:r>
+                    <m:rPr>
+                      <m:sty m:val="p"/>
+                    </m:rPr>
+                    <m:t>u</m:t>
+                  </m:r>
+                  <m:r>
+                    <m:rPr>
+                      <m:sty m:val="p"/>
+                    </m:rPr>
+                    <m:t>e</m:t>
+                  </m:r>
+                </m:sub>
+              </m:sSub>
+              <m:r>
+                <m:rPr>
+                  <m:sty m:val="p"/>
+                </m:rPr>
+                <m:t>+</m:t>
+              </m:r>
+              <m:r>
+                <m:t>0.2534</m:t>
+              </m:r>
+            </m:e>
+          </m:d>
+          <m:r>
+            <m:t>  </m:t>
+          </m:r>
+          <m:r>
+            <m:rPr>
+              <m:nor/>
+              <m:sty m:val="p"/>
+            </m:rPr>
+            <m:t>(Eq. 22b; IDF 2022)</m:t>
+          </m:r>
+        </m:oMath>
+      </m:oMathPara>
     </w:p>
     <w:bookmarkEnd w:id="45"/>
     <w:bookmarkStart w:id="46" w:name="rules-1"/>
@@ -15129,7 +15278,7 @@
         </m:sSub>
       </m:oMath>
       <w:r>
-        <w:t xml:space="preserve">. The same cubic metre is never charged to two products.</w:t>
+        <w:t xml:space="preserve">. The same cubic metre is never charged to two products. The other i-CLEANED indicators (greenhouse gas emissions, land, nitrogen balance, erosion) currently divide the farm total by each product without allocation; extending Eq. 19 to them is proposed to the team (Section 14) so that all indicators use the same rule.</w:t>
       </w:r>
     </w:p>
     <w:p>
@@ -15657,7 +15806,7 @@
         <w:t xml:space="preserve"> </w:t>
       </w:r>
       <w:r>
-        <w:t xml:space="preserve">= 3,092 m³ (Eq. 20); FPCM = 2,280 kg/yr; live weight output = 250 kg/yr.</w:t>
+        <w:t xml:space="preserve">= 3,092 m³ (Eq. 20). Milk: 2,135 kg with 4.3% fat and 3.7% protein, so FPCM = 2,135 × (0.337 + 0.116 × 4.3 + 0.06 × 3.7) = 2,258 kg/yr (Eq. 22). Meat: 2 steers × 125 kg gain × 0.49 carcass fraction = 122.5 kg carcass/yr.</w:t>
       </w:r>
     </w:p>
     <w:p>
@@ -15710,7 +15859,7 @@
         <w:t xml:space="preserve"> </w:t>
       </w:r>
       <w:r>
-        <w:t xml:space="preserve">= 0.60 × 3,092 / 2,280 =</w:t>
+        <w:t xml:space="preserve">= 0.602 × 3,092 / 2,258 =</w:t>
       </w:r>
       <w:r>
         <w:t xml:space="preserve"> </w:t>
@@ -15770,7 +15919,7 @@
         <w:t xml:space="preserve"> </w:t>
       </w:r>
       <w:r>
-        <w:t xml:space="preserve">= 0.40 × 3,092 / 250 =</w:t>
+        <w:t xml:space="preserve">= 0.398 × 3,092 / 122.5 =</w:t>
       </w:r>
       <w:r>
         <w:t xml:space="preserve"> </w:t>
@@ -15780,7 +15929,7 @@
           <w:bCs/>
           <w:b/>
         </w:rPr>
-        <w:t xml:space="preserve">4.92 m³/kg live weight</w:t>
+        <w:t xml:space="preserve">10.05 m³/kg carcass weight</w:t>
       </w:r>
       <w:r>
         <w:t xml:space="preserve"> </w:t>
@@ -15798,7 +15947,31 @@
         <w:pStyle w:val="Compact"/>
       </w:pPr>
       <w:r>
-        <w:t xml:space="preserve">Check: 0.816 × 2,280 + 4.92 × 250 = 1,861 + 1,231 = 3,092 m³, the herd total, so no water is counted twice.</w:t>
+        <w:t xml:space="preserve">Check: 0.824 × 2,258 + 10.05 × 122.5 = 1,861 + 1,231 = 3,092 m³, the herd total, so no water is counted twice.</w:t>
+      </w:r>
+    </w:p>
+    <w:p>
+      <w:pPr>
+        <w:numPr>
+          <w:ilvl w:val="0"/>
+          <w:numId w:val="1013"/>
+        </w:numPr>
+        <w:pStyle w:val="Compact"/>
+      </w:pPr>
+      <w:r>
+        <w:t xml:space="preserve">Edible protein: 2,258 × 3.7% + 122.5 × 26% = 115.4 kg/yr, so 3,092 / 115.4 = 26.8 m³ per kg protein.</w:t>
+      </w:r>
+    </w:p>
+    <w:p>
+      <w:pPr>
+        <w:numPr>
+          <w:ilvl w:val="0"/>
+          <w:numId w:val="1013"/>
+        </w:numPr>
+        <w:pStyle w:val="Compact"/>
+      </w:pPr>
+      <w:r>
+        <w:t xml:space="preserve">Secondary figures: 0.82 m³/kg IDF FPCM (2,280 kg) and 4.92 m³/kg live weight (250 kg).</w:t>
       </w:r>
     </w:p>
     <w:bookmarkEnd w:id="47"/>
@@ -17869,7 +18042,7 @@
         <w:pStyle w:val="FirstParagraph"/>
       </w:pPr>
       <w:r>
-        <w:t xml:space="preserve">Reported: total blue water split into irrigation, drinking and service; the monthly irrigation profile; and blue water per kg FPCM, per kg live weight and per kg wool.</w:t>
+        <w:t xml:space="preserve">Reported: total blue water split into irrigation, drinking and service; the monthly irrigation profile; and blue water per kg FPCM, per kg carcass weight and per kg protein.</w:t>
       </w:r>
     </w:p>
     <w:p>
@@ -19555,7 +19728,7 @@
               <w:t xml:space="preserve"> </w:t>
             </w:r>
             <w:r>
-              <w:t xml:space="preserve">(Eq. 21)</w:t>
+              <w:t xml:space="preserve">(Eq. 21), FPCM by Eq. 22</w:t>
             </w:r>
           </w:p>
         </w:tc>
@@ -19581,7 +19754,7 @@
               <w:jc w:val="left"/>
             </w:pPr>
             <w:r>
-              <w:t xml:space="preserve">m³/kg live weight</w:t>
+              <w:t xml:space="preserve">m³/kg carcass weight</w:t>
             </w:r>
           </w:p>
         </w:tc>
@@ -19648,77 +19821,66 @@
               <w:jc w:val="left"/>
             </w:pPr>
             <w:r>
-              <w:t xml:space="preserve">Green water footprint of wool; of edible protein</w:t>
-            </w:r>
-          </w:p>
-        </w:tc>
-        <w:tc>
-          <w:tcPr/>
-          <w:p>
-            <w:pPr>
-              <w:pStyle w:val="Compact"/>
-              <w:jc w:val="left"/>
-            </w:pPr>
-            <w:r>
-              <w:t xml:space="preserve">m³/kg</w:t>
-            </w:r>
-          </w:p>
-        </w:tc>
-        <w:tc>
-          <w:tcPr/>
-          <w:p>
-            <w:pPr>
-              <w:pStyle w:val="Compact"/>
-              <w:jc w:val="left"/>
-            </w:pPr>
-            <w:r>
-              <w:t xml:space="preserve">Eq. 21; Section 8.4</w:t>
-            </w:r>
-          </w:p>
-        </w:tc>
-      </w:tr>
-      <w:tr>
-        <w:tc>
-          <w:tcPr/>
-          <w:p>
-            <w:pPr>
-              <w:pStyle w:val="Compact"/>
-              <w:jc w:val="left"/>
-            </w:pPr>
-            <w:r>
-              <w:t xml:space="preserve">Green water productivity</w:t>
-            </w:r>
-          </w:p>
-        </w:tc>
-        <w:tc>
-          <w:tcPr/>
-          <w:p>
-            <w:pPr>
-              <w:pStyle w:val="Compact"/>
-              <w:jc w:val="left"/>
-            </w:pPr>
-            <w:r>
-              <w:t xml:space="preserve">kg FPCM/m³; kg live weight/m³</w:t>
-            </w:r>
-          </w:p>
-        </w:tc>
-        <w:tc>
-          <w:tcPr/>
-          <w:p>
-            <w:pPr>
-              <w:pStyle w:val="Compact"/>
-              <w:jc w:val="left"/>
-            </w:pPr>
+              <w:t xml:space="preserve">Green water footprint of edible protein</w:t>
+            </w:r>
+          </w:p>
+        </w:tc>
+        <w:tc>
+          <w:tcPr/>
+          <w:p>
+            <w:pPr>
+              <w:pStyle w:val="Compact"/>
+              <w:jc w:val="left"/>
+            </w:pPr>
+            <w:r>
+              <w:t xml:space="preserve">m³/kg protein</w:t>
+            </w:r>
+          </w:p>
+        </w:tc>
+        <w:tc>
+          <w:tcPr/>
+          <w:p>
+            <w:pPr>
+              <w:pStyle w:val="Compact"/>
+              <w:jc w:val="left"/>
+            </w:pPr>
+            <w:r>
+              <w:t xml:space="preserve">(</w:t>
+            </w:r>
             <m:oMath>
+              <m:r>
+                <m:t>A</m:t>
+              </m:r>
               <m:sSub>
                 <m:e>
                   <m:r>
-                    <m:t>Q</m:t>
+                    <m:t>F</m:t>
                   </m:r>
                 </m:e>
                 <m:sub>
                   <m:r>
-                    <m:t>j</m:t>
+                    <m:rPr>
+                      <m:sty m:val="p"/>
+                    </m:rPr>
+                    <m:t>m</m:t>
+                  </m:r>
+                  <m:r>
+                    <m:rPr>
+                      <m:sty m:val="p"/>
+                    </m:rPr>
+                    <m:t>i</m:t>
+                  </m:r>
+                  <m:r>
+                    <m:rPr>
+                      <m:sty m:val="p"/>
+                    </m:rPr>
+                    <m:t>l</m:t>
+                  </m:r>
+                  <m:r>
+                    <m:rPr>
+                      <m:sty m:val="p"/>
+                    </m:rPr>
+                    <m:t>k</m:t>
                   </m:r>
                 </m:sub>
               </m:sSub>
@@ -19727,7 +19889,10 @@
               <w:t xml:space="preserve"> </w:t>
             </w:r>
             <w:r>
-              <w:t xml:space="preserve">/ (</w:t>
+              <w:t xml:space="preserve">+</w:t>
+            </w:r>
+            <w:r>
+              <w:t xml:space="preserve"> </w:t>
             </w:r>
             <m:oMath>
               <m:r>
@@ -19741,16 +19906,34 @@
                 </m:e>
                 <m:sub>
                   <m:r>
-                    <m:t>j</m:t>
+                    <m:rPr>
+                      <m:sty m:val="p"/>
+                    </m:rPr>
+                    <m:t>m</m:t>
+                  </m:r>
+                  <m:r>
+                    <m:rPr>
+                      <m:sty m:val="p"/>
+                    </m:rPr>
+                    <m:t>e</m:t>
+                  </m:r>
+                  <m:r>
+                    <m:rPr>
+                      <m:sty m:val="p"/>
+                    </m:rPr>
+                    <m:t>a</m:t>
+                  </m:r>
+                  <m:r>
+                    <m:rPr>
+                      <m:sty m:val="p"/>
+                    </m:rPr>
+                    <m:t>t</m:t>
                   </m:r>
                 </m:sub>
               </m:sSub>
             </m:oMath>
             <w:r>
-              <w:t xml:space="preserve"> </w:t>
-            </w:r>
-            <w:r>
-              <w:t xml:space="preserve">×</w:t>
+              <w:t xml:space="preserve">) ×</w:t>
             </w:r>
             <w:r>
               <w:t xml:space="preserve"> </w:t>
@@ -19791,7 +19974,10 @@
               </m:sSub>
             </m:oMath>
             <w:r>
-              <w:t xml:space="preserve">), the form required by FAO (2019)</w:t>
+              <w:t xml:space="preserve"> </w:t>
+            </w:r>
+            <w:r>
+              <w:t xml:space="preserve">/ protein (Section 8.4)</w:t>
             </w:r>
           </w:p>
         </w:tc>
@@ -19805,48 +19991,77 @@
               <w:jc w:val="left"/>
             </w:pPr>
             <w:r>
-              <w:t xml:space="preserve">Share of effective rainfall used for feed</w:t>
-            </w:r>
-          </w:p>
-        </w:tc>
-        <w:tc>
-          <w:tcPr/>
-          <w:p>
-            <w:pPr>
-              <w:pStyle w:val="Compact"/>
-              <w:jc w:val="left"/>
-            </w:pPr>
-            <w:r>
-              <w:t xml:space="preserve">%</w:t>
-            </w:r>
-          </w:p>
-        </w:tc>
-        <w:tc>
-          <w:tcPr/>
-          <w:p>
-            <w:pPr>
-              <w:pStyle w:val="Compact"/>
-              <w:jc w:val="left"/>
-            </w:pPr>
-            <w:r>
-              <w:t xml:space="preserve">Σ</w:t>
-            </w:r>
-            <w:r>
-              <w:t xml:space="preserve"> </w:t>
-            </w:r>
+              <w:t xml:space="preserve">Secondary: per kg IDF FPCM; per kg live weight</w:t>
+            </w:r>
+          </w:p>
+        </w:tc>
+        <w:tc>
+          <w:tcPr/>
+          <w:p>
+            <w:pPr>
+              <w:pStyle w:val="Compact"/>
+              <w:jc w:val="left"/>
+            </w:pPr>
+            <w:r>
+              <w:t xml:space="preserve">m³/kg</w:t>
+            </w:r>
+          </w:p>
+        </w:tc>
+        <w:tc>
+          <w:tcPr/>
+          <w:p>
+            <w:pPr>
+              <w:pStyle w:val="Compact"/>
+              <w:jc w:val="left"/>
+            </w:pPr>
+            <w:r>
+              <w:t xml:space="preserve">Eqs. 21, 22b</w:t>
+            </w:r>
+          </w:p>
+        </w:tc>
+      </w:tr>
+      <w:tr>
+        <w:tc>
+          <w:tcPr/>
+          <w:p>
+            <w:pPr>
+              <w:pStyle w:val="Compact"/>
+              <w:jc w:val="left"/>
+            </w:pPr>
+            <w:r>
+              <w:t xml:space="preserve">Green water productivity</w:t>
+            </w:r>
+          </w:p>
+        </w:tc>
+        <w:tc>
+          <w:tcPr/>
+          <w:p>
+            <w:pPr>
+              <w:pStyle w:val="Compact"/>
+              <w:jc w:val="left"/>
+            </w:pPr>
+            <w:r>
+              <w:t xml:space="preserve">kg FPCM/m³; kg carcass/m³</w:t>
+            </w:r>
+          </w:p>
+        </w:tc>
+        <w:tc>
+          <w:tcPr/>
+          <w:p>
+            <w:pPr>
+              <w:pStyle w:val="Compact"/>
+              <w:jc w:val="left"/>
+            </w:pPr>
             <m:oMath>
-              <m:r>
-                <m:t>E</m:t>
-              </m:r>
               <m:sSub>
                 <m:e>
                   <m:r>
-                    <m:t>T</m:t>
+                    <m:t>Q</m:t>
                   </m:r>
                 </m:e>
                 <m:sub>
                   <m:r>
-                    <m:t>g</m:t>
+                    <m:t>j</m:t>
                   </m:r>
                 </m:sub>
               </m:sSub>
@@ -19855,7 +20070,30 @@
               <w:t xml:space="preserve"> </w:t>
             </w:r>
             <w:r>
-              <w:t xml:space="preserve">over the feed land / Σ</w:t>
+              <w:t xml:space="preserve">/ (</w:t>
+            </w:r>
+            <m:oMath>
+              <m:r>
+                <m:t>A</m:t>
+              </m:r>
+              <m:sSub>
+                <m:e>
+                  <m:r>
+                    <m:t>F</m:t>
+                  </m:r>
+                </m:e>
+                <m:sub>
+                  <m:r>
+                    <m:t>j</m:t>
+                  </m:r>
+                </m:sub>
+              </m:sSub>
+            </m:oMath>
+            <w:r>
+              <w:t xml:space="preserve"> </w:t>
+            </w:r>
+            <w:r>
+              <w:t xml:space="preserve">×</w:t>
             </w:r>
             <w:r>
               <w:t xml:space="preserve"> </w:t>
@@ -19864,10 +20102,16 @@
               <m:sSub>
                 <m:e>
                   <m:r>
-                    <m:t>P</m:t>
+                    <m:t>G</m:t>
                   </m:r>
                 </m:e>
                 <m:sub>
+                  <m:r>
+                    <m:rPr>
+                      <m:sty m:val="p"/>
+                    </m:rPr>
+                    <m:t>h</m:t>
+                  </m:r>
                   <m:r>
                     <m:rPr>
                       <m:sty m:val="p"/>
@@ -19878,7 +20122,100 @@
                     <m:rPr>
                       <m:sty m:val="p"/>
                     </m:rPr>
-                    <m:t>f</m:t>
+                    <m:t>r</m:t>
+                  </m:r>
+                  <m:r>
+                    <m:rPr>
+                      <m:sty m:val="p"/>
+                    </m:rPr>
+                    <m:t>d</m:t>
+                  </m:r>
+                </m:sub>
+              </m:sSub>
+            </m:oMath>
+            <w:r>
+              <w:t xml:space="preserve">), the form required by FAO (2019)</w:t>
+            </w:r>
+          </w:p>
+        </w:tc>
+      </w:tr>
+      <w:tr>
+        <w:tc>
+          <w:tcPr/>
+          <w:p>
+            <w:pPr>
+              <w:pStyle w:val="Compact"/>
+              <w:jc w:val="left"/>
+            </w:pPr>
+            <w:r>
+              <w:t xml:space="preserve">Share of effective rainfall used for feed</w:t>
+            </w:r>
+          </w:p>
+        </w:tc>
+        <w:tc>
+          <w:tcPr/>
+          <w:p>
+            <w:pPr>
+              <w:pStyle w:val="Compact"/>
+              <w:jc w:val="left"/>
+            </w:pPr>
+            <w:r>
+              <w:t xml:space="preserve">%</w:t>
+            </w:r>
+          </w:p>
+        </w:tc>
+        <w:tc>
+          <w:tcPr/>
+          <w:p>
+            <w:pPr>
+              <w:pStyle w:val="Compact"/>
+              <w:jc w:val="left"/>
+            </w:pPr>
+            <w:r>
+              <w:t xml:space="preserve">Σ</w:t>
+            </w:r>
+            <w:r>
+              <w:t xml:space="preserve"> </w:t>
+            </w:r>
+            <m:oMath>
+              <m:r>
+                <m:t>E</m:t>
+              </m:r>
+              <m:sSub>
+                <m:e>
+                  <m:r>
+                    <m:t>T</m:t>
+                  </m:r>
+                </m:e>
+                <m:sub>
+                  <m:r>
+                    <m:t>g</m:t>
+                  </m:r>
+                </m:sub>
+              </m:sSub>
+            </m:oMath>
+            <w:r>
+              <w:t xml:space="preserve"> </w:t>
+            </w:r>
+            <w:r>
+              <w:t xml:space="preserve">over the feed land / Σ</w:t>
+            </w:r>
+            <w:r>
+              <w:t xml:space="preserve"> </w:t>
+            </w:r>
+            <m:oMath>
+              <m:sSub>
+                <m:e>
+                  <m:r>
+                    <m:t>P</m:t>
+                  </m:r>
+                </m:e>
+                <m:sub>
+                  <m:r>
+                    <m:rPr>
+                      <m:sty m:val="p"/>
+                    </m:rPr>
+                    <m:t>e</m:t>
                   </m:r>
                   <m:r>
                     <m:rPr>
@@ -19886,6 +20223,12 @@
                     </m:rPr>
                     <m:t>f</m:t>
                   </m:r>
+                  <m:r>
+                    <m:rPr>
+                      <m:sty m:val="p"/>
+                    </m:rPr>
+                    <m:t>f</m:t>
+                  </m:r>
                 </m:sub>
               </m:sSub>
             </m:oMath>
@@ -20013,6 +20356,37 @@
         </w:tc>
       </w:tr>
     </w:tbl>
+    <w:p>
+      <w:pPr>
+        <w:pStyle w:val="BodyText"/>
+      </w:pPr>
+      <w:r>
+        <w:t xml:space="preserve">No water footprint per kg wool or per unit of draught power is reported; those functions only receive their share</w:t>
+      </w:r>
+      <w:r>
+        <w:t xml:space="preserve"> </w:t>
+      </w:r>
+      <m:oMath>
+        <m:r>
+          <m:t>A</m:t>
+        </m:r>
+        <m:sSub>
+          <m:e>
+            <m:r>
+              <m:t>F</m:t>
+            </m:r>
+          </m:e>
+          <m:sub>
+            <m:r>
+              <m:t>j</m:t>
+            </m:r>
+          </m:sub>
+        </m:sSub>
+      </m:oMath>
+      <w:r>
+        <w:t xml:space="preserve">.</w:t>
+      </w:r>
+    </w:p>
     <w:p>
       <w:pPr>
         <w:pStyle w:val="BodyText"/>
@@ -22060,7 +22434,7 @@
               <w:jc w:val="left"/>
             </w:pPr>
             <w:r>
-              <w:t xml:space="preserve">Feed-energy allocation that sums to 100% (Section 8)</w:t>
+              <w:t xml:space="preserve">Feed-energy allocation that sums to 100% (Section 8); proposed for all i-CLEANED indicators (Section 14)</w:t>
             </w:r>
           </w:p>
         </w:tc>
@@ -22122,19 +22496,19 @@
               <w:jc w:val="left"/>
             </w:pPr>
             <w:r>
-              <w:t xml:space="preserve">IDF 2022 FPCM; live weight output; wool (Section 8.4)</w:t>
-            </w:r>
-          </w:p>
-        </w:tc>
-        <w:tc>
-          <w:tcPr/>
-          <w:p>
-            <w:pPr>
-              <w:pStyle w:val="Compact"/>
-              <w:jc w:val="left"/>
-            </w:pPr>
-            <w:r>
-              <w:t xml:space="preserve">Comparability with the dairy standard</w:t>
+              <w:t xml:space="preserve">Same units as all other i-CLEANED indicators (FAO/GLEAM FPCM, carcass weight, protein); IDF 2022 FPCM and live weight as secondary figures; wool and draught receive a share but no per-unit figure (Section 8.4)</w:t>
+            </w:r>
+          </w:p>
+        </w:tc>
+        <w:tc>
+          <w:tcPr/>
+          <w:p>
+            <w:pPr>
+              <w:pStyle w:val="Compact"/>
+              <w:jc w:val="left"/>
+            </w:pPr>
+            <w:r>
+              <w:t xml:space="preserve">Water results must be comparable with the other i-CLEANED indicators in the same report; the secondary units give comparability with the dairy standard (IDF 2022)</w:t>
             </w:r>
           </w:p>
         </w:tc>
@@ -22604,6 +22978,82 @@
               <w:jc w:val="left"/>
             </w:pPr>
             <w:r>
+              <w:t xml:space="preserve">Extend energy-based allocation (Eq. 19) to greenhouse gas emissions, land, nitrogen balance and erosion</w:t>
+            </w:r>
+          </w:p>
+        </w:tc>
+        <w:tc>
+          <w:tcPr/>
+          <w:p>
+            <w:pPr>
+              <w:pStyle w:val="Compact"/>
+              <w:jc w:val="left"/>
+            </w:pPr>
+            <w:r>
+              <w:t xml:space="preserve">Water allocated; other indicators unchanged (farm total divided by each product)</w:t>
+            </w:r>
+          </w:p>
+        </w:tc>
+        <w:tc>
+          <w:tcPr/>
+          <w:p>
+            <w:pPr>
+              <w:pStyle w:val="Compact"/>
+              <w:jc w:val="left"/>
+            </w:pPr>
+            <w:r>
+              <w:t xml:space="preserve">Today those indicators count the same emissions or land once for milk and again for meat; water would be the only allocated indicator</w:t>
+            </w:r>
+          </w:p>
+        </w:tc>
+      </w:tr>
+      <w:tr>
+        <w:tc>
+          <w:tcPr/>
+          <w:p>
+            <w:pPr>
+              <w:pStyle w:val="Compact"/>
+              <w:jc w:val="left"/>
+            </w:pPr>
+            <w:r>
+              <w:t xml:space="preserve">Report wool as an i-CLEANED output</w:t>
+            </w:r>
+          </w:p>
+        </w:tc>
+        <w:tc>
+          <w:tcPr/>
+          <w:p>
+            <w:pPr>
+              <w:pStyle w:val="Compact"/>
+              <w:jc w:val="left"/>
+            </w:pPr>
+            <w:r>
+              <w:t xml:space="preserve">Not reported; wool receives its water share but no per-kg figure</w:t>
+            </w:r>
+          </w:p>
+        </w:tc>
+        <w:tc>
+          <w:tcPr/>
+          <w:p>
+            <w:pPr>
+              <w:pStyle w:val="Compact"/>
+              <w:jc w:val="left"/>
+            </w:pPr>
+            <w:r>
+              <w:t xml:space="preserve">A per-kg-wool footprint needs wool production in the outputs of all indicators</w:t>
+            </w:r>
+          </w:p>
+        </w:tc>
+      </w:tr>
+      <w:tr>
+        <w:tc>
+          <w:tcPr/>
+          <w:p>
+            <w:pPr>
+              <w:pStyle w:val="Compact"/>
+              <w:jc w:val="left"/>
+            </w:pPr>
+            <w:r>
               <w:t xml:space="preserve">Pasture utilization defaults</w:t>
             </w:r>
           </w:p>
@@ -23055,19 +23505,19 @@
               <w:jc w:val="left"/>
             </w:pPr>
             <w:r>
-              <w:t xml:space="preserve">Treated as true protein</w:t>
-            </w:r>
-          </w:p>
-        </w:tc>
-        <w:tc>
-          <w:tcPr/>
-          <w:p>
-            <w:pPr>
-              <w:pStyle w:val="Compact"/>
-              <w:jc w:val="left"/>
-            </w:pPr>
-            <w:r>
-              <w:t xml:space="preserve">FPCM (Eq. 22) needs true protein</w:t>
+              <w:t xml:space="preserve">Treated as recorded</w:t>
+            </w:r>
+          </w:p>
+        </w:tc>
+        <w:tc>
+          <w:tcPr/>
+          <w:p>
+            <w:pPr>
+              <w:pStyle w:val="Compact"/>
+              <w:jc w:val="left"/>
+            </w:pPr>
+            <w:r>
+              <w:t xml:space="preserve">Only the secondary IDF FPCM (Eq. 22b) needs true protein</w:t>
             </w:r>
           </w:p>
         </w:tc>
@@ -24233,19 +24683,19 @@
               <w:jc w:val="left"/>
             </w:pPr>
             <w:r>
-              <w:t xml:space="preserve">5.98 per kg carcass, all water again to meat</w:t>
-            </w:r>
-          </w:p>
-        </w:tc>
-        <w:tc>
-          <w:tcPr/>
-          <w:p>
-            <w:pPr>
-              <w:pStyle w:val="Compact"/>
-              <w:jc w:val="left"/>
-            </w:pPr>
-            <w:r>
-              <w:t xml:space="preserve">4.92 m³ green per kg live weight (AF 0.40)</w:t>
+              <w:t xml:space="preserve">5.98 per kg carcass weight, all water again to meat</w:t>
+            </w:r>
+          </w:p>
+        </w:tc>
+        <w:tc>
+          <w:tcPr/>
+          <w:p>
+            <w:pPr>
+              <w:pStyle w:val="Compact"/>
+              <w:jc w:val="left"/>
+            </w:pPr>
+            <w:r>
+              <w:t xml:space="preserve">10.05 m³ green per kg carcass weight (AF 0.40)</w:t>
             </w:r>
           </w:p>
         </w:tc>
@@ -24259,31 +24709,31 @@
               <w:jc w:val="left"/>
             </w:pPr>
             <w:r>
-              <w:t xml:space="preserve">Concentrate</w:t>
-            </w:r>
-          </w:p>
-        </w:tc>
-        <w:tc>
-          <w:tcPr/>
-          <w:p>
-            <w:pPr>
-              <w:pStyle w:val="Compact"/>
-              <w:jc w:val="left"/>
-            </w:pPr>
-            <w:r>
-              <w:t xml:space="preserve">Silently zero</w:t>
-            </w:r>
-          </w:p>
-        </w:tc>
-        <w:tc>
-          <w:tcPr/>
-          <w:p>
-            <w:pPr>
-              <w:pStyle w:val="Compact"/>
-              <w:jc w:val="left"/>
-            </w:pPr>
-            <w:r>
-              <w:t xml:space="preserve">9.7% of intake reported as excluded</w:t>
+              <w:t xml:space="preserve">Edible protein</w:t>
+            </w:r>
+          </w:p>
+        </w:tc>
+        <w:tc>
+          <w:tcPr/>
+          <w:p>
+            <w:pPr>
+              <w:pStyle w:val="Compact"/>
+              <w:jc w:val="left"/>
+            </w:pPr>
+            <w:r>
+              <w:t xml:space="preserve">6.35 per kg protein</w:t>
+            </w:r>
+          </w:p>
+        </w:tc>
+        <w:tc>
+          <w:tcPr/>
+          <w:p>
+            <w:pPr>
+              <w:pStyle w:val="Compact"/>
+              <w:jc w:val="left"/>
+            </w:pPr>
+            <w:r>
+              <w:t xml:space="preserve">26.8 m³ green per kg protein</w:t>
             </w:r>
           </w:p>
         </w:tc>
@@ -24297,6 +24747,44 @@
               <w:jc w:val="left"/>
             </w:pPr>
             <w:r>
+              <w:t xml:space="preserve">Concentrate</w:t>
+            </w:r>
+          </w:p>
+        </w:tc>
+        <w:tc>
+          <w:tcPr/>
+          <w:p>
+            <w:pPr>
+              <w:pStyle w:val="Compact"/>
+              <w:jc w:val="left"/>
+            </w:pPr>
+            <w:r>
+              <w:t xml:space="preserve">Silently zero</w:t>
+            </w:r>
+          </w:p>
+        </w:tc>
+        <w:tc>
+          <w:tcPr/>
+          <w:p>
+            <w:pPr>
+              <w:pStyle w:val="Compact"/>
+              <w:jc w:val="left"/>
+            </w:pPr>
+            <w:r>
+              <w:t xml:space="preserve">9.7% of intake reported as excluded</w:t>
+            </w:r>
+          </w:p>
+        </w:tc>
+      </w:tr>
+      <w:tr>
+        <w:tc>
+          <w:tcPr/>
+          <w:p>
+            <w:pPr>
+              <w:pStyle w:val="Compact"/>
+              <w:jc w:val="left"/>
+            </w:pPr>
+            <w:r>
               <w:t xml:space="preserve">Local context</w:t>
             </w:r>
           </w:p>
@@ -24327,6 +24815,14 @@
         </w:tc>
       </w:tr>
     </w:tbl>
+    <w:p>
+      <w:pPr>
+        <w:pStyle w:val="BodyText"/>
+      </w:pPr>
+      <w:r>
+        <w:t xml:space="preserve">Both columns use the same units (FAO/GLEAM FPCM, carcass weight, protein), so the comparison is direct. Secondary figures: 0.82 m³ per kg IDF FPCM and 4.92 m³ per kg live weight.</w:t>
+      </w:r>
+    </w:p>
     <w:p>
       <w:pPr>
         <w:pStyle w:val="BodyText"/>

</xml_diff>